<commit_message>
Update Jun 15/22 weekly reports and add draft markdown; ignore R history and Word lock files
Co-Authored-By: Claude Sonnet 5 <noreply@anthropic.com>
</commit_message>
<xml_diff>
--- a/outputs/weekly-updates/Waabanong Weekly Update - Week of 2026-06-22.docx
+++ b/outputs/weekly-updates/Waabanong Weekly Update - Week of 2026-06-22.docx
@@ -27,8 +27,6 @@
       <w:r>
         <w:t>Delivered June 29, 2026</w:t>
       </w:r>
-      <w:r/>
-      <w:r/>
     </w:p>
     <w:p>
       <w:pPr>
@@ -50,12 +48,13 @@
       </w:pPr>
       <w:r>
         <w:rPr>
+          <w:noProof/>
           <w:sz w:val="12"/>
           <w:szCs w:val="12"/>
           <w:lang w:val="en-CA"/>
         </w:rPr>
         <w:drawing>
-          <wp:anchor distT="0" distB="0" distL="114300" distR="114300" simplePos="0" relativeHeight="251658240" behindDoc="0" locked="0" layoutInCell="1" allowOverlap="1" wp14:anchorId="7AB2F647" wp14:editId="71E18F0D">
+          <wp:anchor distT="0" distB="0" distL="114300" distR="114300" simplePos="0" relativeHeight="251658240" behindDoc="0" locked="0" layoutInCell="1" allowOverlap="1" wp14:anchorId="7AB2F647" wp14:editId="4535C736">
             <wp:simplePos x="0" y="0"/>
             <wp:positionH relativeFrom="column">
               <wp:posOffset>-598744</wp:posOffset>
@@ -387,11 +386,6 @@
             <w:pPr>
               <w:cnfStyle w:val="000000100000" w:firstRow="0" w:lastRow="0" w:firstColumn="0" w:lastColumn="0" w:oddVBand="0" w:evenVBand="0" w:oddHBand="1" w:evenHBand="0" w:firstRowFirstColumn="0" w:firstRowLastColumn="0" w:lastRowFirstColumn="0" w:lastRowLastColumn="0"/>
             </w:pPr>
-            <w:r>
-              <w:rPr>
-                <w:lang w:val="en-CA"/>
-              </w:rPr>
-            </w:r>
           </w:p>
         </w:tc>
       </w:tr>
@@ -462,7 +456,6 @@
             <w:pPr>
               <w:cnfStyle w:val="000000000000" w:firstRow="0" w:lastRow="0" w:firstColumn="0" w:lastColumn="0" w:oddVBand="0" w:evenVBand="0" w:oddHBand="0" w:evenHBand="0" w:firstRowFirstColumn="0" w:firstRowLastColumn="0" w:lastRowFirstColumn="0" w:lastRowLastColumn="0"/>
             </w:pPr>
-            <w:r/>
           </w:p>
         </w:tc>
       </w:tr>
@@ -560,7 +553,6 @@
               <w:rPr>
                 <w:lang w:val="en-CA"/>
               </w:rPr>
-              <w:lastRenderedPageBreak/>
               <w:t>I4 - Intake Management &amp; Automated Notifications</w:t>
             </w:r>
           </w:p>
@@ -611,7 +603,6 @@
             <w:r>
               <w:t>Eligibility check moved to Supervisor Review section; intake prior contacts and self-intake fixes</w:t>
             </w:r>
-            <w:r/>
           </w:p>
         </w:tc>
       </w:tr>
@@ -636,6 +627,7 @@
               <w:rPr>
                 <w:lang w:val="en-CA"/>
               </w:rPr>
+              <w:lastRenderedPageBreak/>
               <w:t>I5</w:t>
             </w:r>
             <w:r>
@@ -791,36 +783,6 @@
                 <w:lang w:val="en-CA"/>
               </w:rPr>
             </w:pPr>
-            <w:r>
-              <w:rPr>
-                <w:lang w:val="en-CA"/>
-              </w:rPr>
-            </w:r>
-            <w:r>
-              <w:rPr>
-                <w:lang w:val="en-CA"/>
-              </w:rPr>
-            </w:r>
-            <w:r>
-              <w:rPr>
-                <w:lang w:val="en-CA"/>
-              </w:rPr>
-            </w:r>
-            <w:r>
-              <w:rPr>
-                <w:lang w:val="en-CA"/>
-              </w:rPr>
-            </w:r>
-            <w:r>
-              <w:rPr>
-                <w:lang w:val="en-CA"/>
-              </w:rPr>
-            </w:r>
-            <w:r>
-              <w:rPr>
-                <w:lang w:val="en-CA"/>
-              </w:rPr>
-            </w:r>
           </w:p>
         </w:tc>
       </w:tr>
@@ -904,11 +866,6 @@
             <w:pPr>
               <w:cnfStyle w:val="000000100000" w:firstRow="0" w:lastRow="0" w:firstColumn="0" w:lastColumn="0" w:oddVBand="0" w:evenVBand="0" w:oddHBand="1" w:evenHBand="0" w:firstRowFirstColumn="0" w:firstRowLastColumn="0" w:lastRowFirstColumn="0" w:lastRowLastColumn="0"/>
             </w:pPr>
-            <w:r>
-              <w:rPr>
-                <w:lang w:val="en-CA"/>
-              </w:rPr>
-            </w:r>
           </w:p>
         </w:tc>
       </w:tr>
@@ -1036,7 +993,6 @@
             <w:pPr>
               <w:cnfStyle w:val="000000100000" w:firstRow="0" w:lastRow="0" w:firstColumn="0" w:lastColumn="0" w:oddVBand="0" w:evenVBand="0" w:oddHBand="1" w:evenHBand="0" w:firstRowFirstColumn="0" w:firstRowLastColumn="0" w:lastRowFirstColumn="0" w:lastRowLastColumn="0"/>
             </w:pPr>
-            <w:r/>
           </w:p>
         </w:tc>
         <w:tc>
@@ -1047,7 +1003,6 @@
             <w:pPr>
               <w:cnfStyle w:val="000000100000" w:firstRow="0" w:lastRow="0" w:firstColumn="0" w:lastColumn="0" w:oddVBand="0" w:evenVBand="0" w:oddHBand="1" w:evenHBand="0" w:firstRowFirstColumn="0" w:firstRowLastColumn="0" w:lastRowFirstColumn="0" w:lastRowLastColumn="0"/>
             </w:pPr>
-            <w:r/>
           </w:p>
         </w:tc>
       </w:tr>
@@ -1144,120 +1099,19 @@
         <w:t>Finance module next steps in motion — documentation sharing completed with Rob; review underway ahead of follow-up design session.</w:t>
       </w:r>
     </w:p>
-    <w:tbl>
-      <w:tblPr>
-        <w:tblStyle w:val="LightList-Accent2"/>
-        <w:tblW w:w="0" w:type="auto"/>
-        <w:tblLook w:val="04A0" w:firstRow="1" w:lastRow="0" w:firstColumn="1" w:lastColumn="0" w:noHBand="0" w:noVBand="1"/>
-      </w:tblPr>
-      <w:tblGrid>
-        <w:gridCol w:w="9340"/>
-      </w:tblGrid>
-      <w:tr>
-        <w:trPr>
-          <w:cnfStyle w:val="100000000000" w:firstRow="1" w:lastRow="0" w:firstColumn="0" w:lastColumn="0" w:oddVBand="0" w:evenVBand="0" w:oddHBand="0" w:evenHBand="0" w:firstRowFirstColumn="0" w:firstRowLastColumn="0" w:lastRowFirstColumn="0" w:lastRowLastColumn="0"/>
-          <w:trHeight w:val="213"/>
-        </w:trPr>
-        <w:tc>
-          <w:tcPr>
-            <w:cnfStyle w:val="001000000000" w:firstRow="0" w:lastRow="0" w:firstColumn="1" w:lastColumn="0" w:oddVBand="0" w:evenVBand="0" w:oddHBand="0" w:evenHBand="0" w:firstRowFirstColumn="0" w:firstRowLastColumn="0" w:lastRowFirstColumn="0" w:lastRowLastColumn="0"/>
-            <w:tcW w:w="9340" w:type="dxa"/>
-            <w:vAlign w:val="center"/>
-          </w:tcPr>
-          <w:p>
-            <w:pPr>
-              <w:pStyle w:val="list1"/>
-              <w:numPr>
-                <w:ilvl w:val="0"/>
-                <w:numId w:val="0"/>
-              </w:numPr>
-              <w:rPr>
-                <w:lang w:val="en-CA"/>
-              </w:rPr>
-            </w:pPr>
-            <w:r>
-              <w:rPr>
-                <w:color w:val="FFFFFF" w:themeColor="background1"/>
-                <w:lang w:val="en-CA"/>
-              </w:rPr>
-              <w:lastRenderedPageBreak/>
-              <w:t>I1 - System Infrastructure &amp; Environments</w:t>
-            </w:r>
-          </w:p>
-        </w:tc>
-      </w:tr>
-      <w:tr>
-        <w:trPr>
-          <w:cnfStyle w:val="000000100000" w:firstRow="0" w:lastRow="0" w:firstColumn="0" w:lastColumn="0" w:oddVBand="0" w:evenVBand="0" w:oddHBand="1" w:evenHBand="0" w:firstRowFirstColumn="0" w:firstRowLastColumn="0" w:lastRowFirstColumn="0" w:lastRowLastColumn="0"/>
-          <w:trHeight w:val="1070"/>
-        </w:trPr>
-        <w:tc>
-          <w:tcPr>
-            <w:cnfStyle w:val="001000000000" w:firstRow="0" w:lastRow="0" w:firstColumn="1" w:lastColumn="0" w:oddVBand="0" w:evenVBand="0" w:oddHBand="0" w:evenHBand="0" w:firstRowFirstColumn="0" w:firstRowLastColumn="0" w:lastRowFirstColumn="0" w:lastRowLastColumn="0"/>
-            <w:tcW w:w="9340" w:type="dxa"/>
-          </w:tcPr>
-          <w:p>
-            <w:pPr>
-              <w:pStyle w:val="Section"/>
-              <w:rPr>
-                <w:b/>
-                <w:bCs/>
-                <w:lang w:val="en-CA"/>
-              </w:rPr>
-            </w:pPr>
-            <w:r>
-              <w:rPr>
-                <w:b/>
-                <w:bCs/>
-                <w:lang w:val="en-CA"/>
-              </w:rPr>
-              <w:t>Features</w:t>
-            </w:r>
-          </w:p>
-          <w:p>
-            <w:pPr>
-              <w:pStyle w:val="list1"/>
-              <w:rPr>
-                <w:lang w:val="en-CA"/>
-              </w:rPr>
-            </w:pPr>
-            <w:r>
-              <w:rPr>
-                <w:b w:val="0"/>
-                <w:bCs w:val="0"/>
-                <w:lang w:val="en-CA"/>
-              </w:rPr>
-              <w:t>Set up Development, Testing, and Production environments</w:t>
-            </w:r>
-          </w:p>
-        </w:tc>
-      </w:tr>
-    </w:tbl>
     <w:p>
       <w:pPr>
-        <w:pStyle w:val="Section"/>
-        <w:rPr>
-          <w:lang w:val="en-CA"/>
-        </w:rPr>
-      </w:pPr>
-      <w:r>
-        <w:rPr>
-          <w:lang w:val="en-CA"/>
-        </w:rPr>
-        <w:t>Weekly Progress</w:t>
-      </w:r>
-    </w:p>
-    <w:p>
-      <w:pPr>
         <w:pStyle w:val="list1"/>
+        <w:numPr>
+          <w:ilvl w:val="0"/>
+          <w:numId w:val="0"/>
+        </w:numPr>
         <w:spacing w:after="360"/>
-        <w:rPr>
-          <w:lang w:val="en-CA"/>
-        </w:rPr>
-      </w:pPr>
-      <w:r>
-        <w:t>No infrastructure changes this week.</w:t>
-      </w:r>
+        <w:ind w:left="720"/>
+        <w:rPr>
+          <w:lang w:val="en-CA"/>
+        </w:rPr>
+      </w:pPr>
     </w:p>
     <w:tbl>
       <w:tblPr>
@@ -1295,7 +1149,7 @@
                 <w:color w:val="FFFFFF" w:themeColor="background1"/>
                 <w:lang w:val="en-CA"/>
               </w:rPr>
-              <w:t>I2 - Login &amp; Authorization</w:t>
+              <w:t>I1 - System Infrastructure &amp; Environments</w:t>
             </w:r>
           </w:p>
         </w:tc>
@@ -1303,7 +1157,7 @@
       <w:tr>
         <w:trPr>
           <w:cnfStyle w:val="000000100000" w:firstRow="0" w:lastRow="0" w:firstColumn="0" w:lastColumn="0" w:oddVBand="0" w:evenVBand="0" w:oddHBand="1" w:evenHBand="0" w:firstRowFirstColumn="0" w:firstRowLastColumn="0" w:lastRowFirstColumn="0" w:lastRowLastColumn="0"/>
-          <w:trHeight w:val="1540"/>
+          <w:trHeight w:val="1070"/>
         </w:trPr>
         <w:tc>
           <w:tcPr>
@@ -1332,34 +1186,16 @@
             <w:pPr>
               <w:pStyle w:val="list1"/>
               <w:rPr>
-                <w:b w:val="0"/>
-                <w:bCs w:val="0"/>
-                <w:lang w:val="en-CA"/>
-              </w:rPr>
-            </w:pPr>
-            <w:r>
-              <w:rPr>
-                <w:b w:val="0"/>
-                <w:bCs w:val="0"/>
-                <w:lang w:val="en-CA"/>
-              </w:rPr>
-              <w:t>Microsoft 365–based authentication</w:t>
-            </w:r>
-          </w:p>
-          <w:p>
-            <w:pPr>
-              <w:pStyle w:val="list1"/>
-              <w:rPr>
-                <w:lang w:val="en-CA"/>
-              </w:rPr>
-            </w:pPr>
-            <w:r>
-              <w:rPr>
-                <w:b w:val="0"/>
-                <w:bCs w:val="0"/>
-                <w:lang w:val="en-CA"/>
-              </w:rPr>
-              <w:t>User login</w:t>
+                <w:lang w:val="en-CA"/>
+              </w:rPr>
+            </w:pPr>
+            <w:r>
+              <w:rPr>
+                <w:b w:val="0"/>
+                <w:bCs w:val="0"/>
+                <w:lang w:val="en-CA"/>
+              </w:rPr>
+              <w:t>Set up Development, Testing, and Production environments</w:t>
             </w:r>
           </w:p>
         </w:tc>
@@ -1388,8 +1224,36 @@
         </w:rPr>
       </w:pPr>
       <w:r>
-        <w:t>No authentication changes this week.</w:t>
+        <w:t>No infrastructure changes this week.</w:t>
       </w:r>
+    </w:p>
+    <w:p>
+      <w:pPr>
+        <w:spacing w:before="0" w:after="160" w:line="278" w:lineRule="auto"/>
+        <w:rPr>
+          <w:lang w:val="en-CA"/>
+        </w:rPr>
+      </w:pPr>
+      <w:r>
+        <w:rPr>
+          <w:lang w:val="en-CA"/>
+        </w:rPr>
+        <w:br w:type="page"/>
+      </w:r>
+    </w:p>
+    <w:p>
+      <w:pPr>
+        <w:pStyle w:val="list1"/>
+        <w:numPr>
+          <w:ilvl w:val="0"/>
+          <w:numId w:val="0"/>
+        </w:numPr>
+        <w:spacing w:after="360"/>
+        <w:ind w:left="720"/>
+        <w:rPr>
+          <w:lang w:val="en-CA"/>
+        </w:rPr>
+      </w:pPr>
     </w:p>
     <w:tbl>
       <w:tblPr>
@@ -1427,7 +1291,7 @@
                 <w:color w:val="FFFFFF" w:themeColor="background1"/>
                 <w:lang w:val="en-CA"/>
               </w:rPr>
-              <w:t>I3 - Client, Member &amp; Family Data</w:t>
+              <w:t>I2 - Login &amp; Authorization</w:t>
             </w:r>
           </w:p>
         </w:tc>
@@ -1463,129 +1327,35 @@
           <w:p>
             <w:pPr>
               <w:pStyle w:val="list1"/>
-              <w:numPr>
-                <w:ilvl w:val="0"/>
-                <w:numId w:val="15"/>
-              </w:numPr>
-              <w:rPr>
-                <w:b w:val="0"/>
-                <w:bCs w:val="0"/>
-                <w:lang w:val="en-CA"/>
-              </w:rPr>
-            </w:pPr>
-            <w:r>
-              <w:rPr>
-                <w:b w:val="0"/>
-                <w:bCs w:val="0"/>
-                <w:lang w:val="en-CA"/>
-              </w:rPr>
-              <w:t>Centralized person records (children, adults, limited profiles)</w:t>
+              <w:rPr>
+                <w:b w:val="0"/>
+                <w:bCs w:val="0"/>
+                <w:lang w:val="en-CA"/>
+              </w:rPr>
+            </w:pPr>
+            <w:r>
+              <w:rPr>
+                <w:b w:val="0"/>
+                <w:bCs w:val="0"/>
+                <w:lang w:val="en-CA"/>
+              </w:rPr>
+              <w:t>Microsoft 365–based authentication</w:t>
             </w:r>
           </w:p>
           <w:p>
             <w:pPr>
               <w:pStyle w:val="list1"/>
-              <w:numPr>
-                <w:ilvl w:val="1"/>
-                <w:numId w:val="8"/>
-              </w:numPr>
-              <w:rPr>
-                <w:b w:val="0"/>
-                <w:bCs w:val="0"/>
-                <w:lang w:val="en-CA"/>
-              </w:rPr>
-            </w:pPr>
-            <w:r>
-              <w:rPr>
-                <w:b w:val="0"/>
-                <w:bCs w:val="0"/>
-                <w:lang w:val="en-CA"/>
-              </w:rPr>
-              <w:t>Duplicate prevention</w:t>
-            </w:r>
-          </w:p>
-          <w:p>
-            <w:pPr>
-              <w:pStyle w:val="list1"/>
-              <w:numPr>
-                <w:ilvl w:val="0"/>
-                <w:numId w:val="15"/>
-              </w:numPr>
-              <w:rPr>
-                <w:b w:val="0"/>
-                <w:bCs w:val="0"/>
-                <w:lang w:val="en-CA"/>
-              </w:rPr>
-            </w:pPr>
-            <w:r>
-              <w:rPr>
-                <w:b w:val="0"/>
-                <w:bCs w:val="0"/>
-                <w:lang w:val="en-CA"/>
-              </w:rPr>
-              <w:t>Family and household structures</w:t>
-            </w:r>
-          </w:p>
-          <w:p>
-            <w:pPr>
-              <w:pStyle w:val="list1"/>
-              <w:numPr>
-                <w:ilvl w:val="1"/>
-                <w:numId w:val="15"/>
-              </w:numPr>
-              <w:rPr>
-                <w:b w:val="0"/>
-                <w:bCs w:val="0"/>
-                <w:lang w:val="en-CA"/>
-              </w:rPr>
-            </w:pPr>
-            <w:r>
-              <w:rPr>
-                <w:b w:val="0"/>
-                <w:bCs w:val="0"/>
-                <w:lang w:val="en-CA"/>
-              </w:rPr>
-              <w:t>Multi-generation relationships</w:t>
-            </w:r>
-          </w:p>
-          <w:p>
-            <w:pPr>
-              <w:pStyle w:val="list1"/>
-              <w:rPr>
-                <w:b w:val="0"/>
-                <w:bCs w:val="0"/>
-                <w:lang w:val="en-CA"/>
-              </w:rPr>
-            </w:pPr>
-            <w:r>
-              <w:rPr>
-                <w:b w:val="0"/>
-                <w:bCs w:val="0"/>
-                <w:lang w:val="en-CA"/>
-              </w:rPr>
-              <w:t>Reciprocal relationship logic</w:t>
-            </w:r>
-          </w:p>
-          <w:p>
-            <w:pPr>
-              <w:pStyle w:val="list1"/>
-              <w:numPr>
-                <w:ilvl w:val="0"/>
-                <w:numId w:val="15"/>
-              </w:numPr>
-              <w:rPr>
-                <w:b w:val="0"/>
-                <w:bCs w:val="0"/>
-                <w:lang w:val="en-CA"/>
-              </w:rPr>
-            </w:pPr>
-            <w:r>
-              <w:rPr>
-                <w:b w:val="0"/>
-                <w:bCs w:val="0"/>
-                <w:lang w:val="en-CA"/>
-              </w:rPr>
-              <w:t>Global search across people and families</w:t>
+              <w:rPr>
+                <w:lang w:val="en-CA"/>
+              </w:rPr>
+            </w:pPr>
+            <w:r>
+              <w:rPr>
+                <w:b w:val="0"/>
+                <w:bCs w:val="0"/>
+                <w:lang w:val="en-CA"/>
+              </w:rPr>
+              <w:t>User login</w:t>
             </w:r>
           </w:p>
         </w:tc>
@@ -1608,50 +1378,28 @@
     <w:p>
       <w:pPr>
         <w:pStyle w:val="list1"/>
+        <w:spacing w:after="360"/>
         <w:rPr>
           <w:lang w:val="en-CA"/>
         </w:rPr>
       </w:pPr>
       <w:r>
-        <w:t>Genogram improvements shipped:</w:t>
+        <w:t>No authentication changes this week.</w:t>
       </w:r>
     </w:p>
     <w:p>
       <w:pPr>
         <w:pStyle w:val="list1"/>
-        <w:rPr>
-          <w:lang w:val="en-CA"/>
-        </w:rPr>
+        <w:numPr>
+          <w:ilvl w:val="0"/>
+          <w:numId w:val="0"/>
+        </w:numPr>
+        <w:spacing w:after="360"/>
         <w:ind w:left="720"/>
-      </w:pPr>
-      <w:r>
-        <w:t>Relationship display updated to correctly include relationship modifiers (e.g., step, adoptive)</w:t>
-      </w:r>
-    </w:p>
-    <w:p>
-      <w:pPr>
-        <w:pStyle w:val="list1"/>
-        <w:rPr>
-          <w:lang w:val="en-CA"/>
-        </w:rPr>
-        <w:ind w:left="720"/>
-      </w:pPr>
-      <w:r>
-        <w:t>Genogram links added for persons involved in cases and intakes — direct navigation from the genogram to related records</w:t>
-      </w:r>
-    </w:p>
-    <w:p>
-      <w:pPr>
-        <w:pStyle w:val="list1"/>
-        <w:spacing w:after="360"/>
-        <w:rPr>
-          <w:lang w:val="en-CA"/>
-        </w:rPr>
-        <w:ind w:left="720"/>
-      </w:pPr>
-      <w:r>
-        <w:t>Chain link icon display fix</w:t>
-      </w:r>
+        <w:rPr>
+          <w:lang w:val="en-CA"/>
+        </w:rPr>
+      </w:pPr>
     </w:p>
     <w:tbl>
       <w:tblPr>
@@ -1689,7 +1437,7 @@
                 <w:color w:val="FFFFFF" w:themeColor="background1"/>
                 <w:lang w:val="en-CA"/>
               </w:rPr>
-              <w:t>I4 - Intake Management &amp; Automated Notifications</w:t>
+              <w:t>I3 - Client, Member &amp; Family Data</w:t>
             </w:r>
           </w:p>
         </w:tc>
@@ -1741,7 +1489,29 @@
                 <w:bCs w:val="0"/>
                 <w:lang w:val="en-CA"/>
               </w:rPr>
-              <w:t>Structured intake workflows with mandatory fields</w:t>
+              <w:t>Centralized person records (children, adults, limited profiles)</w:t>
+            </w:r>
+          </w:p>
+          <w:p>
+            <w:pPr>
+              <w:pStyle w:val="list1"/>
+              <w:numPr>
+                <w:ilvl w:val="1"/>
+                <w:numId w:val="8"/>
+              </w:numPr>
+              <w:rPr>
+                <w:b w:val="0"/>
+                <w:bCs w:val="0"/>
+                <w:lang w:val="en-CA"/>
+              </w:rPr>
+            </w:pPr>
+            <w:r>
+              <w:rPr>
+                <w:b w:val="0"/>
+                <w:bCs w:val="0"/>
+                <w:lang w:val="en-CA"/>
+              </w:rPr>
+              <w:t>Duplicate prevention</w:t>
             </w:r>
           </w:p>
           <w:p>
@@ -1763,7 +1533,47 @@
                 <w:bCs w:val="0"/>
                 <w:lang w:val="en-CA"/>
               </w:rPr>
-              <w:t>Intake status tracking and lifecycle</w:t>
+              <w:t>Family and household structures</w:t>
+            </w:r>
+          </w:p>
+          <w:p>
+            <w:pPr>
+              <w:pStyle w:val="list1"/>
+              <w:numPr>
+                <w:ilvl w:val="1"/>
+                <w:numId w:val="15"/>
+              </w:numPr>
+              <w:rPr>
+                <w:b w:val="0"/>
+                <w:bCs w:val="0"/>
+                <w:lang w:val="en-CA"/>
+              </w:rPr>
+            </w:pPr>
+            <w:r>
+              <w:rPr>
+                <w:b w:val="0"/>
+                <w:bCs w:val="0"/>
+                <w:lang w:val="en-CA"/>
+              </w:rPr>
+              <w:t>Multi-generation relationships</w:t>
+            </w:r>
+          </w:p>
+          <w:p>
+            <w:pPr>
+              <w:pStyle w:val="list1"/>
+              <w:rPr>
+                <w:b w:val="0"/>
+                <w:bCs w:val="0"/>
+                <w:lang w:val="en-CA"/>
+              </w:rPr>
+            </w:pPr>
+            <w:r>
+              <w:rPr>
+                <w:b w:val="0"/>
+                <w:bCs w:val="0"/>
+                <w:lang w:val="en-CA"/>
+              </w:rPr>
+              <w:t>Reciprocal relationship logic</w:t>
             </w:r>
           </w:p>
           <w:p>
@@ -1785,139 +1595,7 @@
                 <w:bCs w:val="0"/>
                 <w:lang w:val="en-CA"/>
               </w:rPr>
-              <w:t>Supervisor review and approval processes</w:t>
-            </w:r>
-          </w:p>
-          <w:p>
-            <w:pPr>
-              <w:pStyle w:val="list1"/>
-              <w:numPr>
-                <w:ilvl w:val="0"/>
-                <w:numId w:val="15"/>
-              </w:numPr>
-              <w:rPr>
-                <w:b w:val="0"/>
-                <w:bCs w:val="0"/>
-                <w:lang w:val="en-CA"/>
-              </w:rPr>
-            </w:pPr>
-            <w:r>
-              <w:rPr>
-                <w:b w:val="0"/>
-                <w:bCs w:val="0"/>
-                <w:lang w:val="en-CA"/>
-              </w:rPr>
-              <w:t>Ability to resolve intake without opening a case</w:t>
-            </w:r>
-          </w:p>
-          <w:p>
-            <w:pPr>
-              <w:pStyle w:val="list1"/>
-              <w:numPr>
-                <w:ilvl w:val="0"/>
-                <w:numId w:val="15"/>
-              </w:numPr>
-              <w:rPr>
-                <w:b w:val="0"/>
-                <w:bCs w:val="0"/>
-                <w:lang w:val="en-CA"/>
-              </w:rPr>
-            </w:pPr>
-            <w:r>
-              <w:rPr>
-                <w:b w:val="0"/>
-                <w:bCs w:val="0"/>
-                <w:lang w:val="en-CA"/>
-              </w:rPr>
-              <w:t>Escalation from intake to case creation</w:t>
-            </w:r>
-          </w:p>
-          <w:p>
-            <w:pPr>
-              <w:pStyle w:val="list1"/>
-              <w:numPr>
-                <w:ilvl w:val="0"/>
-                <w:numId w:val="15"/>
-              </w:numPr>
-              <w:rPr>
-                <w:b w:val="0"/>
-                <w:bCs w:val="0"/>
-                <w:lang w:val="en-CA"/>
-              </w:rPr>
-            </w:pPr>
-            <w:r>
-              <w:rPr>
-                <w:b w:val="0"/>
-                <w:bCs w:val="0"/>
-                <w:lang w:val="en-CA"/>
-              </w:rPr>
-              <w:t>Printable intake records</w:t>
-            </w:r>
-          </w:p>
-          <w:p>
-            <w:pPr>
-              <w:pStyle w:val="list1"/>
-              <w:numPr>
-                <w:ilvl w:val="0"/>
-                <w:numId w:val="15"/>
-              </w:numPr>
-              <w:rPr>
-                <w:b w:val="0"/>
-                <w:bCs w:val="0"/>
-                <w:lang w:val="en-CA"/>
-              </w:rPr>
-            </w:pPr>
-            <w:r>
-              <w:rPr>
-                <w:b w:val="0"/>
-                <w:bCs w:val="0"/>
-                <w:lang w:val="en-CA"/>
-              </w:rPr>
-              <w:t>Automated notifications:</w:t>
-            </w:r>
-          </w:p>
-          <w:p>
-            <w:pPr>
-              <w:pStyle w:val="list1"/>
-              <w:numPr>
-                <w:ilvl w:val="1"/>
-                <w:numId w:val="15"/>
-              </w:numPr>
-              <w:rPr>
-                <w:b w:val="0"/>
-                <w:bCs w:val="0"/>
-                <w:lang w:val="en-CA"/>
-              </w:rPr>
-            </w:pPr>
-            <w:r>
-              <w:rPr>
-                <w:b w:val="0"/>
-                <w:bCs w:val="0"/>
-                <w:lang w:val="en-CA"/>
-              </w:rPr>
-              <w:t>In-application alerts</w:t>
-            </w:r>
-          </w:p>
-          <w:p>
-            <w:pPr>
-              <w:pStyle w:val="list1"/>
-              <w:numPr>
-                <w:ilvl w:val="1"/>
-                <w:numId w:val="15"/>
-              </w:numPr>
-              <w:rPr>
-                <w:b w:val="0"/>
-                <w:bCs w:val="0"/>
-                <w:lang w:val="en-CA"/>
-              </w:rPr>
-            </w:pPr>
-            <w:r>
-              <w:rPr>
-                <w:b w:val="0"/>
-                <w:bCs w:val="0"/>
-                <w:lang w:val="en-CA"/>
-              </w:rPr>
-              <w:t>Defined external channels (email/messaging)</w:t>
+              <w:t>Global search across people and families</w:t>
             </w:r>
           </w:p>
         </w:tc>
@@ -1945,78 +1623,82 @@
         </w:rPr>
       </w:pPr>
       <w:r>
-        <w:t>Eligibility Check moved to the Supervisor Review section of the intake workflow.</w:t>
+        <w:t>Genogram improvements shipped:</w:t>
       </w:r>
     </w:p>
     <w:p>
       <w:pPr>
         <w:pStyle w:val="list1"/>
+        <w:numPr>
+          <w:ilvl w:val="1"/>
+          <w:numId w:val="8"/>
+        </w:numPr>
         <w:rPr>
           <w:lang w:val="en-CA"/>
         </w:rPr>
       </w:pPr>
       <w:r>
-        <w:t>Intake prior contacts and related fixes:</w:t>
+        <w:t>Relationship display updated to correctly include relationship modifiers (e.g., step, adoptive)</w:t>
       </w:r>
     </w:p>
     <w:p>
       <w:pPr>
         <w:pStyle w:val="list1"/>
-        <w:rPr>
-          <w:lang w:val="en-CA"/>
-        </w:rPr>
-        <w:ind w:left="720"/>
+        <w:numPr>
+          <w:ilvl w:val="1"/>
+          <w:numId w:val="8"/>
+        </w:numPr>
+        <w:rPr>
+          <w:lang w:val="en-CA"/>
+        </w:rPr>
       </w:pPr>
       <w:r>
-        <w:t>Fixed: prior contacts missing when viewing intake in edit mode</w:t>
+        <w:t>Genogram links added for persons involved in cases and intakes — direct navigation from the genogram to related records</w:t>
       </w:r>
     </w:p>
     <w:p>
       <w:pPr>
         <w:pStyle w:val="list1"/>
-        <w:rPr>
-          <w:lang w:val="en-CA"/>
-        </w:rPr>
-        <w:ind w:left="720"/>
+        <w:numPr>
+          <w:ilvl w:val="1"/>
+          <w:numId w:val="8"/>
+        </w:numPr>
+        <w:spacing w:after="360"/>
+        <w:rPr>
+          <w:lang w:val="en-CA"/>
+        </w:rPr>
       </w:pPr>
       <w:r>
-        <w:t>Case file link wired up in the prior contacts section — workers can navigate directly to related case files</w:t>
+        <w:t>Chain link icon display fix</w:t>
       </w:r>
     </w:p>
     <w:p>
       <w:pPr>
-        <w:pStyle w:val="list1"/>
-        <w:rPr>
-          <w:lang w:val="en-CA"/>
-        </w:rPr>
-        <w:ind w:left="720"/>
+        <w:spacing w:before="0" w:after="160" w:line="278" w:lineRule="auto"/>
+        <w:rPr>
+          <w:lang w:val="en-CA"/>
+        </w:rPr>
       </w:pPr>
       <w:r>
-        <w:t>Fixed: self-intake fields not being saved correctly</w:t>
+        <w:rPr>
+          <w:lang w:val="en-CA"/>
+        </w:rPr>
+        <w:br w:type="page"/>
       </w:r>
     </w:p>
     <w:p>
       <w:pPr>
         <w:pStyle w:val="list1"/>
-        <w:rPr>
-          <w:lang w:val="en-CA"/>
-        </w:rPr>
-      </w:pPr>
-      <w:r>
-        <w:t>Document replacement logic improved — updating a document now correctly replaces the prior version.</w:t>
-      </w:r>
-    </w:p>
-    <w:p>
-      <w:pPr>
-        <w:pStyle w:val="list1"/>
+        <w:numPr>
+          <w:ilvl w:val="0"/>
+          <w:numId w:val="0"/>
+        </w:numPr>
         <w:spacing w:after="360"/>
-        <w:rPr>
-          <w:lang w:val="en-CA"/>
-        </w:rPr>
-      </w:pPr>
-      <w:r>
-        <w:t>Person activity logging updates.</w:t>
-      </w:r>
+        <w:ind w:left="720"/>
+        <w:rPr>
+          <w:lang w:val="en-CA"/>
+        </w:rPr>
+      </w:pPr>
     </w:p>
     <w:tbl>
       <w:tblPr>
@@ -2054,21 +1736,7 @@
                 <w:color w:val="FFFFFF" w:themeColor="background1"/>
                 <w:lang w:val="en-CA"/>
               </w:rPr>
-              <w:t>I5</w:t>
-            </w:r>
-            <w:r>
-              <w:rPr>
-                <w:color w:val="FFFFFF" w:themeColor="background1"/>
-                <w:lang w:val="en-CA"/>
-              </w:rPr>
-              <w:t xml:space="preserve"> A</w:t>
-            </w:r>
-            <w:r>
-              <w:rPr>
-                <w:color w:val="FFFFFF" w:themeColor="background1"/>
-                <w:lang w:val="en-CA"/>
-              </w:rPr>
-              <w:t xml:space="preserve"> - Case File Management &amp; Signs of Safety</w:t>
+              <w:t>I4 - Intake Management &amp; Automated Notifications</w:t>
             </w:r>
           </w:p>
         </w:tc>
@@ -2098,7 +1766,443 @@
                 <w:bCs/>
                 <w:lang w:val="en-CA"/>
               </w:rPr>
-              <w:lastRenderedPageBreak/>
+              <w:t>Features</w:t>
+            </w:r>
+          </w:p>
+          <w:p>
+            <w:pPr>
+              <w:pStyle w:val="list1"/>
+              <w:numPr>
+                <w:ilvl w:val="0"/>
+                <w:numId w:val="15"/>
+              </w:numPr>
+              <w:rPr>
+                <w:b w:val="0"/>
+                <w:bCs w:val="0"/>
+                <w:lang w:val="en-CA"/>
+              </w:rPr>
+            </w:pPr>
+            <w:r>
+              <w:rPr>
+                <w:b w:val="0"/>
+                <w:bCs w:val="0"/>
+                <w:lang w:val="en-CA"/>
+              </w:rPr>
+              <w:t>Structured intake workflows with mandatory fields</w:t>
+            </w:r>
+          </w:p>
+          <w:p>
+            <w:pPr>
+              <w:pStyle w:val="list1"/>
+              <w:numPr>
+                <w:ilvl w:val="0"/>
+                <w:numId w:val="15"/>
+              </w:numPr>
+              <w:rPr>
+                <w:b w:val="0"/>
+                <w:bCs w:val="0"/>
+                <w:lang w:val="en-CA"/>
+              </w:rPr>
+            </w:pPr>
+            <w:r>
+              <w:rPr>
+                <w:b w:val="0"/>
+                <w:bCs w:val="0"/>
+                <w:lang w:val="en-CA"/>
+              </w:rPr>
+              <w:t>Intake status tracking and lifecycle</w:t>
+            </w:r>
+          </w:p>
+          <w:p>
+            <w:pPr>
+              <w:pStyle w:val="list1"/>
+              <w:numPr>
+                <w:ilvl w:val="0"/>
+                <w:numId w:val="15"/>
+              </w:numPr>
+              <w:rPr>
+                <w:b w:val="0"/>
+                <w:bCs w:val="0"/>
+                <w:lang w:val="en-CA"/>
+              </w:rPr>
+            </w:pPr>
+            <w:r>
+              <w:rPr>
+                <w:b w:val="0"/>
+                <w:bCs w:val="0"/>
+                <w:lang w:val="en-CA"/>
+              </w:rPr>
+              <w:t>Supervisor review and approval processes</w:t>
+            </w:r>
+          </w:p>
+          <w:p>
+            <w:pPr>
+              <w:pStyle w:val="list1"/>
+              <w:numPr>
+                <w:ilvl w:val="0"/>
+                <w:numId w:val="15"/>
+              </w:numPr>
+              <w:rPr>
+                <w:b w:val="0"/>
+                <w:bCs w:val="0"/>
+                <w:lang w:val="en-CA"/>
+              </w:rPr>
+            </w:pPr>
+            <w:r>
+              <w:rPr>
+                <w:b w:val="0"/>
+                <w:bCs w:val="0"/>
+                <w:lang w:val="en-CA"/>
+              </w:rPr>
+              <w:t>Ability to resolve intake without opening a case</w:t>
+            </w:r>
+          </w:p>
+          <w:p>
+            <w:pPr>
+              <w:pStyle w:val="list1"/>
+              <w:numPr>
+                <w:ilvl w:val="0"/>
+                <w:numId w:val="15"/>
+              </w:numPr>
+              <w:rPr>
+                <w:b w:val="0"/>
+                <w:bCs w:val="0"/>
+                <w:lang w:val="en-CA"/>
+              </w:rPr>
+            </w:pPr>
+            <w:r>
+              <w:rPr>
+                <w:b w:val="0"/>
+                <w:bCs w:val="0"/>
+                <w:lang w:val="en-CA"/>
+              </w:rPr>
+              <w:t>Escalation from intake to case creation</w:t>
+            </w:r>
+          </w:p>
+          <w:p>
+            <w:pPr>
+              <w:pStyle w:val="list1"/>
+              <w:numPr>
+                <w:ilvl w:val="0"/>
+                <w:numId w:val="15"/>
+              </w:numPr>
+              <w:rPr>
+                <w:b w:val="0"/>
+                <w:bCs w:val="0"/>
+                <w:lang w:val="en-CA"/>
+              </w:rPr>
+            </w:pPr>
+            <w:r>
+              <w:rPr>
+                <w:b w:val="0"/>
+                <w:bCs w:val="0"/>
+                <w:lang w:val="en-CA"/>
+              </w:rPr>
+              <w:t>Printable intake records</w:t>
+            </w:r>
+          </w:p>
+          <w:p>
+            <w:pPr>
+              <w:pStyle w:val="list1"/>
+              <w:numPr>
+                <w:ilvl w:val="0"/>
+                <w:numId w:val="15"/>
+              </w:numPr>
+              <w:rPr>
+                <w:b w:val="0"/>
+                <w:bCs w:val="0"/>
+                <w:lang w:val="en-CA"/>
+              </w:rPr>
+            </w:pPr>
+            <w:r>
+              <w:rPr>
+                <w:b w:val="0"/>
+                <w:bCs w:val="0"/>
+                <w:lang w:val="en-CA"/>
+              </w:rPr>
+              <w:t>Automated notifications:</w:t>
+            </w:r>
+          </w:p>
+          <w:p>
+            <w:pPr>
+              <w:pStyle w:val="list1"/>
+              <w:numPr>
+                <w:ilvl w:val="1"/>
+                <w:numId w:val="15"/>
+              </w:numPr>
+              <w:rPr>
+                <w:b w:val="0"/>
+                <w:bCs w:val="0"/>
+                <w:lang w:val="en-CA"/>
+              </w:rPr>
+            </w:pPr>
+            <w:r>
+              <w:rPr>
+                <w:b w:val="0"/>
+                <w:bCs w:val="0"/>
+                <w:lang w:val="en-CA"/>
+              </w:rPr>
+              <w:t>In-application alerts</w:t>
+            </w:r>
+          </w:p>
+          <w:p>
+            <w:pPr>
+              <w:pStyle w:val="list1"/>
+              <w:numPr>
+                <w:ilvl w:val="1"/>
+                <w:numId w:val="15"/>
+              </w:numPr>
+              <w:rPr>
+                <w:b w:val="0"/>
+                <w:bCs w:val="0"/>
+                <w:lang w:val="en-CA"/>
+              </w:rPr>
+            </w:pPr>
+            <w:r>
+              <w:rPr>
+                <w:b w:val="0"/>
+                <w:bCs w:val="0"/>
+                <w:lang w:val="en-CA"/>
+              </w:rPr>
+              <w:t>Defined external channels (email/messaging)</w:t>
+            </w:r>
+          </w:p>
+        </w:tc>
+      </w:tr>
+    </w:tbl>
+    <w:p>
+      <w:pPr>
+        <w:pStyle w:val="Section"/>
+        <w:rPr>
+          <w:lang w:val="en-CA"/>
+        </w:rPr>
+      </w:pPr>
+      <w:r>
+        <w:rPr>
+          <w:lang w:val="en-CA"/>
+        </w:rPr>
+        <w:t>Weekly Progress</w:t>
+      </w:r>
+    </w:p>
+    <w:p>
+      <w:pPr>
+        <w:pStyle w:val="list1"/>
+        <w:rPr>
+          <w:lang w:val="en-CA"/>
+        </w:rPr>
+      </w:pPr>
+      <w:r>
+        <w:t>Eligibility Check moved to the Supervisor Review section of the intake workflow.</w:t>
+      </w:r>
+    </w:p>
+    <w:p>
+      <w:pPr>
+        <w:pStyle w:val="list1"/>
+        <w:rPr>
+          <w:lang w:val="en-CA"/>
+        </w:rPr>
+      </w:pPr>
+      <w:proofErr w:type="gramStart"/>
+      <w:r>
+        <w:t>Intake</w:t>
+      </w:r>
+      <w:proofErr w:type="gramEnd"/>
+      <w:r>
+        <w:t xml:space="preserve"> prior contacts and related fixes:</w:t>
+      </w:r>
+    </w:p>
+    <w:p>
+      <w:pPr>
+        <w:pStyle w:val="list1"/>
+        <w:numPr>
+          <w:ilvl w:val="1"/>
+          <w:numId w:val="8"/>
+        </w:numPr>
+        <w:rPr>
+          <w:lang w:val="en-CA"/>
+        </w:rPr>
+      </w:pPr>
+      <w:r>
+        <w:t xml:space="preserve">Fixed: </w:t>
+      </w:r>
+      <w:proofErr w:type="gramStart"/>
+      <w:r>
+        <w:t>prior</w:t>
+      </w:r>
+      <w:proofErr w:type="gramEnd"/>
+      <w:r>
+        <w:t xml:space="preserve"> contacts missing when viewing intake in edit mode</w:t>
+      </w:r>
+    </w:p>
+    <w:p>
+      <w:pPr>
+        <w:pStyle w:val="list1"/>
+        <w:numPr>
+          <w:ilvl w:val="1"/>
+          <w:numId w:val="8"/>
+        </w:numPr>
+        <w:rPr>
+          <w:lang w:val="en-CA"/>
+        </w:rPr>
+      </w:pPr>
+      <w:r>
+        <w:t>Case file link wired up in the prior contacts section — workers can navigate directly to related case files</w:t>
+      </w:r>
+    </w:p>
+    <w:p>
+      <w:pPr>
+        <w:pStyle w:val="list1"/>
+        <w:numPr>
+          <w:ilvl w:val="1"/>
+          <w:numId w:val="8"/>
+        </w:numPr>
+        <w:rPr>
+          <w:lang w:val="en-CA"/>
+        </w:rPr>
+      </w:pPr>
+      <w:r>
+        <w:t>Fixed: self-intake fields not being saved correctly</w:t>
+      </w:r>
+    </w:p>
+    <w:p>
+      <w:pPr>
+        <w:pStyle w:val="list1"/>
+        <w:numPr>
+          <w:ilvl w:val="1"/>
+          <w:numId w:val="8"/>
+        </w:numPr>
+        <w:rPr>
+          <w:lang w:val="en-CA"/>
+        </w:rPr>
+      </w:pPr>
+      <w:r>
+        <w:t>Document replacement logic improved — updating a document now correctly replaces the prior version.</w:t>
+      </w:r>
+    </w:p>
+    <w:p>
+      <w:pPr>
+        <w:pStyle w:val="list1"/>
+        <w:numPr>
+          <w:ilvl w:val="1"/>
+          <w:numId w:val="8"/>
+        </w:numPr>
+        <w:spacing w:after="360"/>
+        <w:rPr>
+          <w:lang w:val="en-CA"/>
+        </w:rPr>
+      </w:pPr>
+      <w:r>
+        <w:t>Person activity logging updates.</w:t>
+      </w:r>
+    </w:p>
+    <w:p>
+      <w:pPr>
+        <w:spacing w:before="0" w:after="160" w:line="278" w:lineRule="auto"/>
+        <w:rPr>
+          <w:lang w:val="en-CA"/>
+        </w:rPr>
+      </w:pPr>
+      <w:r>
+        <w:rPr>
+          <w:lang w:val="en-CA"/>
+        </w:rPr>
+        <w:br w:type="page"/>
+      </w:r>
+    </w:p>
+    <w:p>
+      <w:pPr>
+        <w:pStyle w:val="list1"/>
+        <w:numPr>
+          <w:ilvl w:val="0"/>
+          <w:numId w:val="0"/>
+        </w:numPr>
+        <w:spacing w:after="360"/>
+        <w:ind w:left="720"/>
+        <w:rPr>
+          <w:lang w:val="en-CA"/>
+        </w:rPr>
+      </w:pPr>
+    </w:p>
+    <w:tbl>
+      <w:tblPr>
+        <w:tblStyle w:val="LightList-Accent2"/>
+        <w:tblW w:w="0" w:type="auto"/>
+        <w:tblLook w:val="04A0" w:firstRow="1" w:lastRow="0" w:firstColumn="1" w:lastColumn="0" w:noHBand="0" w:noVBand="1"/>
+      </w:tblPr>
+      <w:tblGrid>
+        <w:gridCol w:w="9340"/>
+      </w:tblGrid>
+      <w:tr>
+        <w:trPr>
+          <w:cnfStyle w:val="100000000000" w:firstRow="1" w:lastRow="0" w:firstColumn="0" w:lastColumn="0" w:oddVBand="0" w:evenVBand="0" w:oddHBand="0" w:evenHBand="0" w:firstRowFirstColumn="0" w:firstRowLastColumn="0" w:lastRowFirstColumn="0" w:lastRowLastColumn="0"/>
+          <w:trHeight w:val="213"/>
+        </w:trPr>
+        <w:tc>
+          <w:tcPr>
+            <w:cnfStyle w:val="001000000000" w:firstRow="0" w:lastRow="0" w:firstColumn="1" w:lastColumn="0" w:oddVBand="0" w:evenVBand="0" w:oddHBand="0" w:evenHBand="0" w:firstRowFirstColumn="0" w:firstRowLastColumn="0" w:lastRowFirstColumn="0" w:lastRowLastColumn="0"/>
+            <w:tcW w:w="9340" w:type="dxa"/>
+            <w:vAlign w:val="center"/>
+          </w:tcPr>
+          <w:p>
+            <w:pPr>
+              <w:pStyle w:val="list1"/>
+              <w:numPr>
+                <w:ilvl w:val="0"/>
+                <w:numId w:val="0"/>
+              </w:numPr>
+              <w:rPr>
+                <w:lang w:val="en-CA"/>
+              </w:rPr>
+            </w:pPr>
+            <w:r>
+              <w:rPr>
+                <w:color w:val="FFFFFF" w:themeColor="background1"/>
+                <w:lang w:val="en-CA"/>
+              </w:rPr>
+              <w:t>I5</w:t>
+            </w:r>
+            <w:r>
+              <w:rPr>
+                <w:color w:val="FFFFFF" w:themeColor="background1"/>
+                <w:lang w:val="en-CA"/>
+              </w:rPr>
+              <w:t xml:space="preserve"> A</w:t>
+            </w:r>
+            <w:r>
+              <w:rPr>
+                <w:color w:val="FFFFFF" w:themeColor="background1"/>
+                <w:lang w:val="en-CA"/>
+              </w:rPr>
+              <w:t xml:space="preserve"> - Case File Management &amp; Signs of Safety</w:t>
+            </w:r>
+          </w:p>
+        </w:tc>
+      </w:tr>
+      <w:tr>
+        <w:trPr>
+          <w:cnfStyle w:val="000000100000" w:firstRow="0" w:lastRow="0" w:firstColumn="0" w:lastColumn="0" w:oddVBand="0" w:evenVBand="0" w:oddHBand="1" w:evenHBand="0" w:firstRowFirstColumn="0" w:firstRowLastColumn="0" w:lastRowFirstColumn="0" w:lastRowLastColumn="0"/>
+          <w:trHeight w:val="1540"/>
+        </w:trPr>
+        <w:tc>
+          <w:tcPr>
+            <w:cnfStyle w:val="001000000000" w:firstRow="0" w:lastRow="0" w:firstColumn="1" w:lastColumn="0" w:oddVBand="0" w:evenVBand="0" w:oddHBand="0" w:evenHBand="0" w:firstRowFirstColumn="0" w:firstRowLastColumn="0" w:lastRowFirstColumn="0" w:lastRowLastColumn="0"/>
+            <w:tcW w:w="9340" w:type="dxa"/>
+          </w:tcPr>
+          <w:p>
+            <w:pPr>
+              <w:pStyle w:val="Section"/>
+              <w:rPr>
+                <w:b/>
+                <w:bCs/>
+                <w:lang w:val="en-CA"/>
+              </w:rPr>
+            </w:pPr>
+            <w:r>
+              <w:rPr>
+                <w:b/>
+                <w:bCs/>
+                <w:lang w:val="en-CA"/>
+              </w:rPr>
               <w:t>Features</w:t>
             </w:r>
           </w:p>
@@ -2376,7 +2480,6 @@
         <w:rPr>
           <w:lang w:val="en-CA"/>
         </w:rPr>
-        <w:ind w:left="720"/>
       </w:pPr>
       <w:r>
         <w:t>Fixed: resource home type not displaying caregiver information</w:t>
@@ -2388,7 +2491,6 @@
         <w:rPr>
           <w:lang w:val="en-CA"/>
         </w:rPr>
-        <w:ind w:left="720"/>
       </w:pPr>
       <w:r>
         <w:t>Placement search fix</w:t>
@@ -2400,10 +2502,17 @@
         <w:rPr>
           <w:lang w:val="en-CA"/>
         </w:rPr>
-        <w:ind w:left="720"/>
       </w:pPr>
       <w:r>
-        <w:t>Placement end date validation added</w:t>
+        <w:t xml:space="preserve">Placement </w:t>
+      </w:r>
+      <w:proofErr w:type="gramStart"/>
+      <w:r>
+        <w:t>end</w:t>
+      </w:r>
+      <w:proofErr w:type="gramEnd"/>
+      <w:r>
+        <w:t xml:space="preserve"> date validation added</w:t>
       </w:r>
     </w:p>
     <w:p>
@@ -2642,6 +2751,28 @@
         <w:t>No new developments this week; solution design continues.</w:t>
       </w:r>
     </w:p>
+    <w:p>
+      <w:pPr>
+        <w:spacing w:before="0" w:after="160" w:line="278" w:lineRule="auto"/>
+      </w:pPr>
+      <w:r>
+        <w:br w:type="page"/>
+      </w:r>
+    </w:p>
+    <w:p>
+      <w:pPr>
+        <w:pStyle w:val="list1"/>
+        <w:numPr>
+          <w:ilvl w:val="0"/>
+          <w:numId w:val="0"/>
+        </w:numPr>
+        <w:spacing w:after="360"/>
+        <w:ind w:left="720"/>
+        <w:rPr>
+          <w:lang w:val="en-CA"/>
+        </w:rPr>
+      </w:pPr>
+    </w:p>
     <w:tbl>
       <w:tblPr>
         <w:tblStyle w:val="LightList-Accent2"/>
@@ -2708,7 +2839,6 @@
                 <w:bCs/>
                 <w:lang w:val="en-CA"/>
               </w:rPr>
-              <w:lastRenderedPageBreak/>
               <w:t>Features</w:t>
             </w:r>
           </w:p>
@@ -2812,6 +2942,15 @@
       <w:r>
         <w:t>No data migration activity this week.</w:t>
       </w:r>
+    </w:p>
+    <w:p>
+      <w:pPr>
+        <w:pStyle w:val="list1"/>
+        <w:spacing w:after="360"/>
+        <w:rPr>
+          <w:lang w:val="en-CA"/>
+        </w:rPr>
+      </w:pPr>
     </w:p>
     <w:tbl>
       <w:tblPr>
@@ -2979,6 +3118,20 @@
       <w:r>
         <w:t>Finance module in solution design following June 19 requirements session — Rob reviewing shared documentation (GL codes, funding stream maps, PO forms, policy manual); follow-up design session to be scheduled on completion.</w:t>
       </w:r>
+    </w:p>
+    <w:p>
+      <w:pPr>
+        <w:pStyle w:val="list1"/>
+        <w:numPr>
+          <w:ilvl w:val="0"/>
+          <w:numId w:val="0"/>
+        </w:numPr>
+        <w:spacing w:after="360"/>
+        <w:ind w:left="720"/>
+        <w:rPr>
+          <w:lang w:val="en-CA"/>
+        </w:rPr>
+      </w:pPr>
     </w:p>
     <w:tbl>
       <w:tblPr>
@@ -3287,7 +3440,7 @@
           <wp:extent cx="1428115" cy="357028"/>
           <wp:effectExtent l="0" t="0" r="635" b="5080"/>
           <wp:wrapNone/>
-          <wp:docPr id="17" name="Picture 559663804">
+          <wp:docPr id="2076742082" name="Picture 559663804">
             <a:extLst xmlns:a="http://schemas.openxmlformats.org/drawingml/2006/main">
               <a:ext uri="{FF2B5EF4-FFF2-40B4-BE49-F238E27FC236}">
                 <a16:creationId xmlns:a16="http://schemas.microsoft.com/office/drawing/2014/main" id="{BA02F97D-7065-4B84-AFAF-E7BFCC270E65}"/>

</xml_diff>

<commit_message>
Fix broken regression fixture; add report tiering and evidence normalization
- Extract the missing extracted_image_0.png fixture from the accepted
  May 2026 deliverable so the weekly-updates regression test can run again.
- generate-report: split Action Items and Issues into New/Changed/Carried
  Forward buckets with an aging flag for long-open items, instead of one
  ever-growing flat table.
- ingest-evidence: add narrow, mechanical email-body normalization
  (strip repeated disclaimers, redundant nested quote history, repeated
  signature blocks, tracking pixels) while preserving full evidentiary
  content — reduces noise without losing the verbatim audit trail.

Co-Authored-By: Claude Sonnet 5 <noreply@anthropic.com>
</commit_message>
<xml_diff>
--- a/outputs/weekly-updates/Waabanong Weekly Update - Week of 2026-06-22.docx
+++ b/outputs/weekly-updates/Waabanong Weekly Update - Week of 2026-06-22.docx
@@ -27,6 +27,8 @@
       <w:r>
         <w:t>Delivered June 29, 2026</w:t>
       </w:r>
+      <w:r/>
+      <w:r/>
     </w:p>
     <w:p>
       <w:pPr>
@@ -48,13 +50,12 @@
       </w:pPr>
       <w:r>
         <w:rPr>
-          <w:noProof/>
           <w:sz w:val="12"/>
           <w:szCs w:val="12"/>
           <w:lang w:val="en-CA"/>
         </w:rPr>
         <w:drawing>
-          <wp:anchor distT="0" distB="0" distL="114300" distR="114300" simplePos="0" relativeHeight="251658240" behindDoc="0" locked="0" layoutInCell="1" allowOverlap="1" wp14:anchorId="7AB2F647" wp14:editId="4535C736">
+          <wp:anchor distT="0" distB="0" distL="114300" distR="114300" simplePos="0" relativeHeight="251658240" behindDoc="0" locked="0" layoutInCell="1" allowOverlap="1" wp14:anchorId="7AB2F647" wp14:editId="71E18F0D">
             <wp:simplePos x="0" y="0"/>
             <wp:positionH relativeFrom="column">
               <wp:posOffset>-598744</wp:posOffset>
@@ -386,6 +387,11 @@
             <w:pPr>
               <w:cnfStyle w:val="000000100000" w:firstRow="0" w:lastRow="0" w:firstColumn="0" w:lastColumn="0" w:oddVBand="0" w:evenVBand="0" w:oddHBand="1" w:evenHBand="0" w:firstRowFirstColumn="0" w:firstRowLastColumn="0" w:lastRowFirstColumn="0" w:lastRowLastColumn="0"/>
             </w:pPr>
+            <w:r>
+              <w:rPr>
+                <w:lang w:val="en-CA"/>
+              </w:rPr>
+            </w:r>
           </w:p>
         </w:tc>
       </w:tr>
@@ -456,6 +462,7 @@
             <w:pPr>
               <w:cnfStyle w:val="000000000000" w:firstRow="0" w:lastRow="0" w:firstColumn="0" w:lastColumn="0" w:oddVBand="0" w:evenVBand="0" w:oddHBand="0" w:evenHBand="0" w:firstRowFirstColumn="0" w:firstRowLastColumn="0" w:lastRowFirstColumn="0" w:lastRowLastColumn="0"/>
             </w:pPr>
+            <w:r/>
           </w:p>
         </w:tc>
       </w:tr>
@@ -553,6 +560,7 @@
               <w:rPr>
                 <w:lang w:val="en-CA"/>
               </w:rPr>
+              <w:lastRenderedPageBreak/>
               <w:t>I4 - Intake Management &amp; Automated Notifications</w:t>
             </w:r>
           </w:p>
@@ -603,6 +611,7 @@
             <w:r>
               <w:t>Eligibility check moved to Supervisor Review section; intake prior contacts and self-intake fixes</w:t>
             </w:r>
+            <w:r/>
           </w:p>
         </w:tc>
       </w:tr>
@@ -627,7 +636,6 @@
               <w:rPr>
                 <w:lang w:val="en-CA"/>
               </w:rPr>
-              <w:lastRenderedPageBreak/>
               <w:t>I5</w:t>
             </w:r>
             <w:r>
@@ -783,6 +791,36 @@
                 <w:lang w:val="en-CA"/>
               </w:rPr>
             </w:pPr>
+            <w:r>
+              <w:rPr>
+                <w:lang w:val="en-CA"/>
+              </w:rPr>
+            </w:r>
+            <w:r>
+              <w:rPr>
+                <w:lang w:val="en-CA"/>
+              </w:rPr>
+            </w:r>
+            <w:r>
+              <w:rPr>
+                <w:lang w:val="en-CA"/>
+              </w:rPr>
+            </w:r>
+            <w:r>
+              <w:rPr>
+                <w:lang w:val="en-CA"/>
+              </w:rPr>
+            </w:r>
+            <w:r>
+              <w:rPr>
+                <w:lang w:val="en-CA"/>
+              </w:rPr>
+            </w:r>
+            <w:r>
+              <w:rPr>
+                <w:lang w:val="en-CA"/>
+              </w:rPr>
+            </w:r>
           </w:p>
         </w:tc>
       </w:tr>
@@ -866,6 +904,11 @@
             <w:pPr>
               <w:cnfStyle w:val="000000100000" w:firstRow="0" w:lastRow="0" w:firstColumn="0" w:lastColumn="0" w:oddVBand="0" w:evenVBand="0" w:oddHBand="1" w:evenHBand="0" w:firstRowFirstColumn="0" w:firstRowLastColumn="0" w:lastRowFirstColumn="0" w:lastRowLastColumn="0"/>
             </w:pPr>
+            <w:r>
+              <w:rPr>
+                <w:lang w:val="en-CA"/>
+              </w:rPr>
+            </w:r>
           </w:p>
         </w:tc>
       </w:tr>
@@ -993,6 +1036,7 @@
             <w:pPr>
               <w:cnfStyle w:val="000000100000" w:firstRow="0" w:lastRow="0" w:firstColumn="0" w:lastColumn="0" w:oddVBand="0" w:evenVBand="0" w:oddHBand="1" w:evenHBand="0" w:firstRowFirstColumn="0" w:firstRowLastColumn="0" w:lastRowFirstColumn="0" w:lastRowLastColumn="0"/>
             </w:pPr>
+            <w:r/>
           </w:p>
         </w:tc>
         <w:tc>
@@ -1003,6 +1047,7 @@
             <w:pPr>
               <w:cnfStyle w:val="000000100000" w:firstRow="0" w:lastRow="0" w:firstColumn="0" w:lastColumn="0" w:oddVBand="0" w:evenVBand="0" w:oddHBand="1" w:evenHBand="0" w:firstRowFirstColumn="0" w:firstRowLastColumn="0" w:lastRowFirstColumn="0" w:lastRowLastColumn="0"/>
             </w:pPr>
+            <w:r/>
           </w:p>
         </w:tc>
       </w:tr>
@@ -1099,19 +1144,120 @@
         <w:t>Finance module next steps in motion — documentation sharing completed with Rob; review underway ahead of follow-up design session.</w:t>
       </w:r>
     </w:p>
+    <w:tbl>
+      <w:tblPr>
+        <w:tblStyle w:val="LightList-Accent2"/>
+        <w:tblW w:w="0" w:type="auto"/>
+        <w:tblLook w:val="04A0" w:firstRow="1" w:lastRow="0" w:firstColumn="1" w:lastColumn="0" w:noHBand="0" w:noVBand="1"/>
+      </w:tblPr>
+      <w:tblGrid>
+        <w:gridCol w:w="9340"/>
+      </w:tblGrid>
+      <w:tr>
+        <w:trPr>
+          <w:cnfStyle w:val="100000000000" w:firstRow="1" w:lastRow="0" w:firstColumn="0" w:lastColumn="0" w:oddVBand="0" w:evenVBand="0" w:oddHBand="0" w:evenHBand="0" w:firstRowFirstColumn="0" w:firstRowLastColumn="0" w:lastRowFirstColumn="0" w:lastRowLastColumn="0"/>
+          <w:trHeight w:val="213"/>
+        </w:trPr>
+        <w:tc>
+          <w:tcPr>
+            <w:cnfStyle w:val="001000000000" w:firstRow="0" w:lastRow="0" w:firstColumn="1" w:lastColumn="0" w:oddVBand="0" w:evenVBand="0" w:oddHBand="0" w:evenHBand="0" w:firstRowFirstColumn="0" w:firstRowLastColumn="0" w:lastRowFirstColumn="0" w:lastRowLastColumn="0"/>
+            <w:tcW w:w="9340" w:type="dxa"/>
+            <w:vAlign w:val="center"/>
+          </w:tcPr>
+          <w:p>
+            <w:pPr>
+              <w:pStyle w:val="list1"/>
+              <w:numPr>
+                <w:ilvl w:val="0"/>
+                <w:numId w:val="0"/>
+              </w:numPr>
+              <w:rPr>
+                <w:lang w:val="en-CA"/>
+              </w:rPr>
+            </w:pPr>
+            <w:r>
+              <w:rPr>
+                <w:color w:val="FFFFFF" w:themeColor="background1"/>
+                <w:lang w:val="en-CA"/>
+              </w:rPr>
+              <w:lastRenderedPageBreak/>
+              <w:t>I1 - System Infrastructure &amp; Environments</w:t>
+            </w:r>
+          </w:p>
+        </w:tc>
+      </w:tr>
+      <w:tr>
+        <w:trPr>
+          <w:cnfStyle w:val="000000100000" w:firstRow="0" w:lastRow="0" w:firstColumn="0" w:lastColumn="0" w:oddVBand="0" w:evenVBand="0" w:oddHBand="1" w:evenHBand="0" w:firstRowFirstColumn="0" w:firstRowLastColumn="0" w:lastRowFirstColumn="0" w:lastRowLastColumn="0"/>
+          <w:trHeight w:val="1070"/>
+        </w:trPr>
+        <w:tc>
+          <w:tcPr>
+            <w:cnfStyle w:val="001000000000" w:firstRow="0" w:lastRow="0" w:firstColumn="1" w:lastColumn="0" w:oddVBand="0" w:evenVBand="0" w:oddHBand="0" w:evenHBand="0" w:firstRowFirstColumn="0" w:firstRowLastColumn="0" w:lastRowFirstColumn="0" w:lastRowLastColumn="0"/>
+            <w:tcW w:w="9340" w:type="dxa"/>
+          </w:tcPr>
+          <w:p>
+            <w:pPr>
+              <w:pStyle w:val="Section"/>
+              <w:rPr>
+                <w:b/>
+                <w:bCs/>
+                <w:lang w:val="en-CA"/>
+              </w:rPr>
+            </w:pPr>
+            <w:r>
+              <w:rPr>
+                <w:b/>
+                <w:bCs/>
+                <w:lang w:val="en-CA"/>
+              </w:rPr>
+              <w:t>Features</w:t>
+            </w:r>
+          </w:p>
+          <w:p>
+            <w:pPr>
+              <w:pStyle w:val="list1"/>
+              <w:rPr>
+                <w:lang w:val="en-CA"/>
+              </w:rPr>
+            </w:pPr>
+            <w:r>
+              <w:rPr>
+                <w:b w:val="0"/>
+                <w:bCs w:val="0"/>
+                <w:lang w:val="en-CA"/>
+              </w:rPr>
+              <w:t>Set up Development, Testing, and Production environments</w:t>
+            </w:r>
+          </w:p>
+        </w:tc>
+      </w:tr>
+    </w:tbl>
     <w:p>
       <w:pPr>
-        <w:pStyle w:val="list1"/>
-        <w:numPr>
-          <w:ilvl w:val="0"/>
-          <w:numId w:val="0"/>
-        </w:numPr>
-        <w:spacing w:after="360"/>
-        <w:ind w:left="720"/>
+        <w:pStyle w:val="Section"/>
         <w:rPr>
           <w:lang w:val="en-CA"/>
         </w:rPr>
       </w:pPr>
+      <w:r>
+        <w:rPr>
+          <w:lang w:val="en-CA"/>
+        </w:rPr>
+        <w:t>Weekly Progress</w:t>
+      </w:r>
+    </w:p>
+    <w:p>
+      <w:pPr>
+        <w:pStyle w:val="list1"/>
+        <w:spacing w:after="360"/>
+        <w:rPr>
+          <w:lang w:val="en-CA"/>
+        </w:rPr>
+      </w:pPr>
+      <w:r>
+        <w:t>No infrastructure changes this week.</w:t>
+      </w:r>
     </w:p>
     <w:tbl>
       <w:tblPr>
@@ -1149,7 +1295,7 @@
                 <w:color w:val="FFFFFF" w:themeColor="background1"/>
                 <w:lang w:val="en-CA"/>
               </w:rPr>
-              <w:t>I1 - System Infrastructure &amp; Environments</w:t>
+              <w:t>I2 - Login &amp; Authorization</w:t>
             </w:r>
           </w:p>
         </w:tc>
@@ -1157,7 +1303,7 @@
       <w:tr>
         <w:trPr>
           <w:cnfStyle w:val="000000100000" w:firstRow="0" w:lastRow="0" w:firstColumn="0" w:lastColumn="0" w:oddVBand="0" w:evenVBand="0" w:oddHBand="1" w:evenHBand="0" w:firstRowFirstColumn="0" w:firstRowLastColumn="0" w:lastRowFirstColumn="0" w:lastRowLastColumn="0"/>
-          <w:trHeight w:val="1070"/>
+          <w:trHeight w:val="1540"/>
         </w:trPr>
         <w:tc>
           <w:tcPr>
@@ -1186,16 +1332,34 @@
             <w:pPr>
               <w:pStyle w:val="list1"/>
               <w:rPr>
-                <w:lang w:val="en-CA"/>
-              </w:rPr>
-            </w:pPr>
-            <w:r>
-              <w:rPr>
-                <w:b w:val="0"/>
-                <w:bCs w:val="0"/>
-                <w:lang w:val="en-CA"/>
-              </w:rPr>
-              <w:t>Set up Development, Testing, and Production environments</w:t>
+                <w:b w:val="0"/>
+                <w:bCs w:val="0"/>
+                <w:lang w:val="en-CA"/>
+              </w:rPr>
+            </w:pPr>
+            <w:r>
+              <w:rPr>
+                <w:b w:val="0"/>
+                <w:bCs w:val="0"/>
+                <w:lang w:val="en-CA"/>
+              </w:rPr>
+              <w:t>Microsoft 365–based authentication</w:t>
+            </w:r>
+          </w:p>
+          <w:p>
+            <w:pPr>
+              <w:pStyle w:val="list1"/>
+              <w:rPr>
+                <w:lang w:val="en-CA"/>
+              </w:rPr>
+            </w:pPr>
+            <w:r>
+              <w:rPr>
+                <w:b w:val="0"/>
+                <w:bCs w:val="0"/>
+                <w:lang w:val="en-CA"/>
+              </w:rPr>
+              <w:t>User login</w:t>
             </w:r>
           </w:p>
         </w:tc>
@@ -1224,36 +1388,8 @@
         </w:rPr>
       </w:pPr>
       <w:r>
-        <w:t>No infrastructure changes this week.</w:t>
+        <w:t>No authentication changes this week.</w:t>
       </w:r>
-    </w:p>
-    <w:p>
-      <w:pPr>
-        <w:spacing w:before="0" w:after="160" w:line="278" w:lineRule="auto"/>
-        <w:rPr>
-          <w:lang w:val="en-CA"/>
-        </w:rPr>
-      </w:pPr>
-      <w:r>
-        <w:rPr>
-          <w:lang w:val="en-CA"/>
-        </w:rPr>
-        <w:br w:type="page"/>
-      </w:r>
-    </w:p>
-    <w:p>
-      <w:pPr>
-        <w:pStyle w:val="list1"/>
-        <w:numPr>
-          <w:ilvl w:val="0"/>
-          <w:numId w:val="0"/>
-        </w:numPr>
-        <w:spacing w:after="360"/>
-        <w:ind w:left="720"/>
-        <w:rPr>
-          <w:lang w:val="en-CA"/>
-        </w:rPr>
-      </w:pPr>
     </w:p>
     <w:tbl>
       <w:tblPr>
@@ -1291,7 +1427,7 @@
                 <w:color w:val="FFFFFF" w:themeColor="background1"/>
                 <w:lang w:val="en-CA"/>
               </w:rPr>
-              <w:t>I2 - Login &amp; Authorization</w:t>
+              <w:t>I3 - Client, Member &amp; Family Data</w:t>
             </w:r>
           </w:p>
         </w:tc>
@@ -1327,35 +1463,129 @@
           <w:p>
             <w:pPr>
               <w:pStyle w:val="list1"/>
-              <w:rPr>
-                <w:b w:val="0"/>
-                <w:bCs w:val="0"/>
-                <w:lang w:val="en-CA"/>
-              </w:rPr>
-            </w:pPr>
-            <w:r>
-              <w:rPr>
-                <w:b w:val="0"/>
-                <w:bCs w:val="0"/>
-                <w:lang w:val="en-CA"/>
-              </w:rPr>
-              <w:t>Microsoft 365–based authentication</w:t>
+              <w:numPr>
+                <w:ilvl w:val="0"/>
+                <w:numId w:val="15"/>
+              </w:numPr>
+              <w:rPr>
+                <w:b w:val="0"/>
+                <w:bCs w:val="0"/>
+                <w:lang w:val="en-CA"/>
+              </w:rPr>
+            </w:pPr>
+            <w:r>
+              <w:rPr>
+                <w:b w:val="0"/>
+                <w:bCs w:val="0"/>
+                <w:lang w:val="en-CA"/>
+              </w:rPr>
+              <w:t>Centralized person records (children, adults, limited profiles)</w:t>
             </w:r>
           </w:p>
           <w:p>
             <w:pPr>
               <w:pStyle w:val="list1"/>
-              <w:rPr>
-                <w:lang w:val="en-CA"/>
-              </w:rPr>
-            </w:pPr>
-            <w:r>
-              <w:rPr>
-                <w:b w:val="0"/>
-                <w:bCs w:val="0"/>
-                <w:lang w:val="en-CA"/>
-              </w:rPr>
-              <w:t>User login</w:t>
+              <w:numPr>
+                <w:ilvl w:val="1"/>
+                <w:numId w:val="8"/>
+              </w:numPr>
+              <w:rPr>
+                <w:b w:val="0"/>
+                <w:bCs w:val="0"/>
+                <w:lang w:val="en-CA"/>
+              </w:rPr>
+            </w:pPr>
+            <w:r>
+              <w:rPr>
+                <w:b w:val="0"/>
+                <w:bCs w:val="0"/>
+                <w:lang w:val="en-CA"/>
+              </w:rPr>
+              <w:t>Duplicate prevention</w:t>
+            </w:r>
+          </w:p>
+          <w:p>
+            <w:pPr>
+              <w:pStyle w:val="list1"/>
+              <w:numPr>
+                <w:ilvl w:val="0"/>
+                <w:numId w:val="15"/>
+              </w:numPr>
+              <w:rPr>
+                <w:b w:val="0"/>
+                <w:bCs w:val="0"/>
+                <w:lang w:val="en-CA"/>
+              </w:rPr>
+            </w:pPr>
+            <w:r>
+              <w:rPr>
+                <w:b w:val="0"/>
+                <w:bCs w:val="0"/>
+                <w:lang w:val="en-CA"/>
+              </w:rPr>
+              <w:t>Family and household structures</w:t>
+            </w:r>
+          </w:p>
+          <w:p>
+            <w:pPr>
+              <w:pStyle w:val="list1"/>
+              <w:numPr>
+                <w:ilvl w:val="1"/>
+                <w:numId w:val="15"/>
+              </w:numPr>
+              <w:rPr>
+                <w:b w:val="0"/>
+                <w:bCs w:val="0"/>
+                <w:lang w:val="en-CA"/>
+              </w:rPr>
+            </w:pPr>
+            <w:r>
+              <w:rPr>
+                <w:b w:val="0"/>
+                <w:bCs w:val="0"/>
+                <w:lang w:val="en-CA"/>
+              </w:rPr>
+              <w:t>Multi-generation relationships</w:t>
+            </w:r>
+          </w:p>
+          <w:p>
+            <w:pPr>
+              <w:pStyle w:val="list1"/>
+              <w:rPr>
+                <w:b w:val="0"/>
+                <w:bCs w:val="0"/>
+                <w:lang w:val="en-CA"/>
+              </w:rPr>
+            </w:pPr>
+            <w:r>
+              <w:rPr>
+                <w:b w:val="0"/>
+                <w:bCs w:val="0"/>
+                <w:lang w:val="en-CA"/>
+              </w:rPr>
+              <w:t>Reciprocal relationship logic</w:t>
+            </w:r>
+          </w:p>
+          <w:p>
+            <w:pPr>
+              <w:pStyle w:val="list1"/>
+              <w:numPr>
+                <w:ilvl w:val="0"/>
+                <w:numId w:val="15"/>
+              </w:numPr>
+              <w:rPr>
+                <w:b w:val="0"/>
+                <w:bCs w:val="0"/>
+                <w:lang w:val="en-CA"/>
+              </w:rPr>
+            </w:pPr>
+            <w:r>
+              <w:rPr>
+                <w:b w:val="0"/>
+                <w:bCs w:val="0"/>
+                <w:lang w:val="en-CA"/>
+              </w:rPr>
+              <w:t>Global search across people and families</w:t>
             </w:r>
           </w:p>
         </w:tc>
@@ -1378,28 +1608,50 @@
     <w:p>
       <w:pPr>
         <w:pStyle w:val="list1"/>
+        <w:rPr>
+          <w:lang w:val="en-CA"/>
+        </w:rPr>
+      </w:pPr>
+      <w:r>
+        <w:t>Genogram improvements shipped:</w:t>
+      </w:r>
+    </w:p>
+    <w:p>
+      <w:pPr>
+        <w:pStyle w:val="list1"/>
+        <w:rPr>
+          <w:lang w:val="en-CA"/>
+        </w:rPr>
+        <w:ind w:left="720"/>
+      </w:pPr>
+      <w:r>
+        <w:t>Relationship display updated to correctly include relationship modifiers (e.g., step, adoptive)</w:t>
+      </w:r>
+    </w:p>
+    <w:p>
+      <w:pPr>
+        <w:pStyle w:val="list1"/>
+        <w:rPr>
+          <w:lang w:val="en-CA"/>
+        </w:rPr>
+        <w:ind w:left="720"/>
+      </w:pPr>
+      <w:r>
+        <w:t>Genogram links added for persons involved in cases and intakes — direct navigation from the genogram to related records</w:t>
+      </w:r>
+    </w:p>
+    <w:p>
+      <w:pPr>
+        <w:pStyle w:val="list1"/>
         <w:spacing w:after="360"/>
         <w:rPr>
           <w:lang w:val="en-CA"/>
         </w:rPr>
+        <w:ind w:left="720"/>
       </w:pPr>
       <w:r>
-        <w:t>No authentication changes this week.</w:t>
+        <w:t>Chain link icon display fix</w:t>
       </w:r>
-    </w:p>
-    <w:p>
-      <w:pPr>
-        <w:pStyle w:val="list1"/>
-        <w:numPr>
-          <w:ilvl w:val="0"/>
-          <w:numId w:val="0"/>
-        </w:numPr>
-        <w:spacing w:after="360"/>
-        <w:ind w:left="720"/>
-        <w:rPr>
-          <w:lang w:val="en-CA"/>
-        </w:rPr>
-      </w:pPr>
     </w:p>
     <w:tbl>
       <w:tblPr>
@@ -1437,7 +1689,7 @@
                 <w:color w:val="FFFFFF" w:themeColor="background1"/>
                 <w:lang w:val="en-CA"/>
               </w:rPr>
-              <w:t>I3 - Client, Member &amp; Family Data</w:t>
+              <w:t>I4 - Intake Management &amp; Automated Notifications</w:t>
             </w:r>
           </w:p>
         </w:tc>
@@ -1489,29 +1741,7 @@
                 <w:bCs w:val="0"/>
                 <w:lang w:val="en-CA"/>
               </w:rPr>
-              <w:t>Centralized person records (children, adults, limited profiles)</w:t>
-            </w:r>
-          </w:p>
-          <w:p>
-            <w:pPr>
-              <w:pStyle w:val="list1"/>
-              <w:numPr>
-                <w:ilvl w:val="1"/>
-                <w:numId w:val="8"/>
-              </w:numPr>
-              <w:rPr>
-                <w:b w:val="0"/>
-                <w:bCs w:val="0"/>
-                <w:lang w:val="en-CA"/>
-              </w:rPr>
-            </w:pPr>
-            <w:r>
-              <w:rPr>
-                <w:b w:val="0"/>
-                <w:bCs w:val="0"/>
-                <w:lang w:val="en-CA"/>
-              </w:rPr>
-              <w:t>Duplicate prevention</w:t>
+              <w:t>Structured intake workflows with mandatory fields</w:t>
             </w:r>
           </w:p>
           <w:p>
@@ -1533,7 +1763,117 @@
                 <w:bCs w:val="0"/>
                 <w:lang w:val="en-CA"/>
               </w:rPr>
-              <w:t>Family and household structures</w:t>
+              <w:t>Intake status tracking and lifecycle</w:t>
+            </w:r>
+          </w:p>
+          <w:p>
+            <w:pPr>
+              <w:pStyle w:val="list1"/>
+              <w:numPr>
+                <w:ilvl w:val="0"/>
+                <w:numId w:val="15"/>
+              </w:numPr>
+              <w:rPr>
+                <w:b w:val="0"/>
+                <w:bCs w:val="0"/>
+                <w:lang w:val="en-CA"/>
+              </w:rPr>
+            </w:pPr>
+            <w:r>
+              <w:rPr>
+                <w:b w:val="0"/>
+                <w:bCs w:val="0"/>
+                <w:lang w:val="en-CA"/>
+              </w:rPr>
+              <w:t>Supervisor review and approval processes</w:t>
+            </w:r>
+          </w:p>
+          <w:p>
+            <w:pPr>
+              <w:pStyle w:val="list1"/>
+              <w:numPr>
+                <w:ilvl w:val="0"/>
+                <w:numId w:val="15"/>
+              </w:numPr>
+              <w:rPr>
+                <w:b w:val="0"/>
+                <w:bCs w:val="0"/>
+                <w:lang w:val="en-CA"/>
+              </w:rPr>
+            </w:pPr>
+            <w:r>
+              <w:rPr>
+                <w:b w:val="0"/>
+                <w:bCs w:val="0"/>
+                <w:lang w:val="en-CA"/>
+              </w:rPr>
+              <w:t>Ability to resolve intake without opening a case</w:t>
+            </w:r>
+          </w:p>
+          <w:p>
+            <w:pPr>
+              <w:pStyle w:val="list1"/>
+              <w:numPr>
+                <w:ilvl w:val="0"/>
+                <w:numId w:val="15"/>
+              </w:numPr>
+              <w:rPr>
+                <w:b w:val="0"/>
+                <w:bCs w:val="0"/>
+                <w:lang w:val="en-CA"/>
+              </w:rPr>
+            </w:pPr>
+            <w:r>
+              <w:rPr>
+                <w:b w:val="0"/>
+                <w:bCs w:val="0"/>
+                <w:lang w:val="en-CA"/>
+              </w:rPr>
+              <w:t>Escalation from intake to case creation</w:t>
+            </w:r>
+          </w:p>
+          <w:p>
+            <w:pPr>
+              <w:pStyle w:val="list1"/>
+              <w:numPr>
+                <w:ilvl w:val="0"/>
+                <w:numId w:val="15"/>
+              </w:numPr>
+              <w:rPr>
+                <w:b w:val="0"/>
+                <w:bCs w:val="0"/>
+                <w:lang w:val="en-CA"/>
+              </w:rPr>
+            </w:pPr>
+            <w:r>
+              <w:rPr>
+                <w:b w:val="0"/>
+                <w:bCs w:val="0"/>
+                <w:lang w:val="en-CA"/>
+              </w:rPr>
+              <w:t>Printable intake records</w:t>
+            </w:r>
+          </w:p>
+          <w:p>
+            <w:pPr>
+              <w:pStyle w:val="list1"/>
+              <w:numPr>
+                <w:ilvl w:val="0"/>
+                <w:numId w:val="15"/>
+              </w:numPr>
+              <w:rPr>
+                <w:b w:val="0"/>
+                <w:bCs w:val="0"/>
+                <w:lang w:val="en-CA"/>
+              </w:rPr>
+            </w:pPr>
+            <w:r>
+              <w:rPr>
+                <w:b w:val="0"/>
+                <w:bCs w:val="0"/>
+                <w:lang w:val="en-CA"/>
+              </w:rPr>
+              <w:t>Automated notifications:</w:t>
             </w:r>
           </w:p>
           <w:p>
@@ -1555,32 +1895,14 @@
                 <w:bCs w:val="0"/>
                 <w:lang w:val="en-CA"/>
               </w:rPr>
-              <w:t>Multi-generation relationships</w:t>
-            </w:r>
-          </w:p>
-          <w:p>
-            <w:pPr>
-              <w:pStyle w:val="list1"/>
-              <w:rPr>
-                <w:b w:val="0"/>
-                <w:bCs w:val="0"/>
-                <w:lang w:val="en-CA"/>
-              </w:rPr>
-            </w:pPr>
-            <w:r>
-              <w:rPr>
-                <w:b w:val="0"/>
-                <w:bCs w:val="0"/>
-                <w:lang w:val="en-CA"/>
-              </w:rPr>
-              <w:t>Reciprocal relationship logic</w:t>
+              <w:t>In-application alerts</w:t>
             </w:r>
           </w:p>
           <w:p>
             <w:pPr>
               <w:pStyle w:val="list1"/>
               <w:numPr>
-                <w:ilvl w:val="0"/>
+                <w:ilvl w:val="1"/>
                 <w:numId w:val="15"/>
               </w:numPr>
               <w:rPr>
@@ -1595,7 +1917,7 @@
                 <w:bCs w:val="0"/>
                 <w:lang w:val="en-CA"/>
               </w:rPr>
-              <w:t>Global search across people and families</w:t>
+              <w:t>Defined external channels (email/messaging)</w:t>
             </w:r>
           </w:p>
         </w:tc>
@@ -1623,82 +1945,78 @@
         </w:rPr>
       </w:pPr>
       <w:r>
-        <w:t>Genogram improvements shipped:</w:t>
+        <w:t>Eligibility Check moved to the Supervisor Review section of the intake workflow.</w:t>
       </w:r>
     </w:p>
     <w:p>
       <w:pPr>
         <w:pStyle w:val="list1"/>
-        <w:numPr>
-          <w:ilvl w:val="1"/>
-          <w:numId w:val="8"/>
-        </w:numPr>
         <w:rPr>
           <w:lang w:val="en-CA"/>
         </w:rPr>
       </w:pPr>
       <w:r>
-        <w:t>Relationship display updated to correctly include relationship modifiers (e.g., step, adoptive)</w:t>
+        <w:t>Intake prior contacts and related fixes:</w:t>
       </w:r>
     </w:p>
     <w:p>
       <w:pPr>
         <w:pStyle w:val="list1"/>
-        <w:numPr>
-          <w:ilvl w:val="1"/>
-          <w:numId w:val="8"/>
-        </w:numPr>
         <w:rPr>
           <w:lang w:val="en-CA"/>
         </w:rPr>
+        <w:ind w:left="720"/>
       </w:pPr>
       <w:r>
-        <w:t>Genogram links added for persons involved in cases and intakes — direct navigation from the genogram to related records</w:t>
+        <w:t>Fixed: prior contacts missing when viewing intake in edit mode</w:t>
       </w:r>
     </w:p>
     <w:p>
       <w:pPr>
         <w:pStyle w:val="list1"/>
-        <w:numPr>
-          <w:ilvl w:val="1"/>
-          <w:numId w:val="8"/>
-        </w:numPr>
+        <w:rPr>
+          <w:lang w:val="en-CA"/>
+        </w:rPr>
+        <w:ind w:left="720"/>
+      </w:pPr>
+      <w:r>
+        <w:t>Case file link wired up in the prior contacts section — workers can navigate directly to related case files</w:t>
+      </w:r>
+    </w:p>
+    <w:p>
+      <w:pPr>
+        <w:pStyle w:val="list1"/>
+        <w:rPr>
+          <w:lang w:val="en-CA"/>
+        </w:rPr>
+        <w:ind w:left="720"/>
+      </w:pPr>
+      <w:r>
+        <w:t>Fixed: self-intake fields not being saved correctly</w:t>
+      </w:r>
+    </w:p>
+    <w:p>
+      <w:pPr>
+        <w:pStyle w:val="list1"/>
+        <w:rPr>
+          <w:lang w:val="en-CA"/>
+        </w:rPr>
+      </w:pPr>
+      <w:r>
+        <w:t>Document replacement logic improved — updating a document now correctly replaces the prior version.</w:t>
+      </w:r>
+    </w:p>
+    <w:p>
+      <w:pPr>
+        <w:pStyle w:val="list1"/>
         <w:spacing w:after="360"/>
         <w:rPr>
           <w:lang w:val="en-CA"/>
         </w:rPr>
       </w:pPr>
       <w:r>
-        <w:t>Chain link icon display fix</w:t>
+        <w:t>Person activity logging updates.</w:t>
       </w:r>
-    </w:p>
-    <w:p>
-      <w:pPr>
-        <w:spacing w:before="0" w:after="160" w:line="278" w:lineRule="auto"/>
-        <w:rPr>
-          <w:lang w:val="en-CA"/>
-        </w:rPr>
-      </w:pPr>
-      <w:r>
-        <w:rPr>
-          <w:lang w:val="en-CA"/>
-        </w:rPr>
-        <w:br w:type="page"/>
-      </w:r>
-    </w:p>
-    <w:p>
-      <w:pPr>
-        <w:pStyle w:val="list1"/>
-        <w:numPr>
-          <w:ilvl w:val="0"/>
-          <w:numId w:val="0"/>
-        </w:numPr>
-        <w:spacing w:after="360"/>
-        <w:ind w:left="720"/>
-        <w:rPr>
-          <w:lang w:val="en-CA"/>
-        </w:rPr>
-      </w:pPr>
     </w:p>
     <w:tbl>
       <w:tblPr>
@@ -1736,7 +2054,21 @@
                 <w:color w:val="FFFFFF" w:themeColor="background1"/>
                 <w:lang w:val="en-CA"/>
               </w:rPr>
-              <w:t>I4 - Intake Management &amp; Automated Notifications</w:t>
+              <w:t>I5</w:t>
+            </w:r>
+            <w:r>
+              <w:rPr>
+                <w:color w:val="FFFFFF" w:themeColor="background1"/>
+                <w:lang w:val="en-CA"/>
+              </w:rPr>
+              <w:t xml:space="preserve"> A</w:t>
+            </w:r>
+            <w:r>
+              <w:rPr>
+                <w:color w:val="FFFFFF" w:themeColor="background1"/>
+                <w:lang w:val="en-CA"/>
+              </w:rPr>
+              <w:t xml:space="preserve"> - Case File Management &amp; Signs of Safety</w:t>
             </w:r>
           </w:p>
         </w:tc>
@@ -1766,7 +2098,168 @@
                 <w:bCs/>
                 <w:lang w:val="en-CA"/>
               </w:rPr>
+              <w:lastRenderedPageBreak/>
               <w:t>Features</w:t>
+            </w:r>
+          </w:p>
+          <w:p>
+            <w:pPr>
+              <w:pStyle w:val="list1"/>
+              <w:rPr>
+                <w:b w:val="0"/>
+                <w:bCs w:val="0"/>
+                <w:lang w:val="en-CA"/>
+              </w:rPr>
+            </w:pPr>
+            <w:r>
+              <w:rPr>
+                <w:b w:val="0"/>
+                <w:bCs w:val="0"/>
+                <w:lang w:val="en-CA"/>
+              </w:rPr>
+              <w:t>Case file creation and lifecycle management</w:t>
+            </w:r>
+          </w:p>
+          <w:p>
+            <w:pPr>
+              <w:pStyle w:val="list1"/>
+              <w:rPr>
+                <w:b w:val="0"/>
+                <w:bCs w:val="0"/>
+                <w:lang w:val="en-CA"/>
+              </w:rPr>
+            </w:pPr>
+            <w:r>
+              <w:rPr>
+                <w:b w:val="0"/>
+                <w:bCs w:val="0"/>
+                <w:lang w:val="en-CA"/>
+              </w:rPr>
+              <w:t>Assignment of caseworkers and supervisors</w:t>
+            </w:r>
+          </w:p>
+          <w:p>
+            <w:pPr>
+              <w:pStyle w:val="list1"/>
+              <w:rPr>
+                <w:b w:val="0"/>
+                <w:bCs w:val="0"/>
+                <w:lang w:val="en-CA"/>
+              </w:rPr>
+            </w:pPr>
+            <w:r>
+              <w:rPr>
+                <w:b w:val="0"/>
+                <w:bCs w:val="0"/>
+                <w:lang w:val="en-CA"/>
+              </w:rPr>
+              <w:t>Case reassignment with approval</w:t>
+            </w:r>
+          </w:p>
+          <w:p>
+            <w:pPr>
+              <w:pStyle w:val="list1"/>
+              <w:rPr>
+                <w:b w:val="0"/>
+                <w:bCs w:val="0"/>
+                <w:lang w:val="en-CA"/>
+              </w:rPr>
+            </w:pPr>
+            <w:r>
+              <w:rPr>
+                <w:b w:val="0"/>
+                <w:bCs w:val="0"/>
+                <w:lang w:val="en-CA"/>
+              </w:rPr>
+              <w:t>Signs of Safety–aligned workflows, including:</w:t>
+            </w:r>
+          </w:p>
+          <w:p>
+            <w:pPr>
+              <w:pStyle w:val="list1"/>
+              <w:numPr>
+                <w:ilvl w:val="1"/>
+                <w:numId w:val="8"/>
+              </w:numPr>
+              <w:rPr>
+                <w:b w:val="0"/>
+                <w:bCs w:val="0"/>
+                <w:lang w:val="en-CA"/>
+              </w:rPr>
+            </w:pPr>
+            <w:r>
+              <w:rPr>
+                <w:b w:val="0"/>
+                <w:bCs w:val="0"/>
+                <w:lang w:val="en-CA"/>
+              </w:rPr>
+              <w:t>Placement</w:t>
+            </w:r>
+          </w:p>
+          <w:p>
+            <w:pPr>
+              <w:pStyle w:val="list1"/>
+              <w:numPr>
+                <w:ilvl w:val="1"/>
+                <w:numId w:val="8"/>
+              </w:numPr>
+              <w:rPr>
+                <w:b w:val="0"/>
+                <w:bCs w:val="0"/>
+                <w:lang w:val="en-CA"/>
+              </w:rPr>
+            </w:pPr>
+            <w:r>
+              <w:rPr>
+                <w:b w:val="0"/>
+                <w:bCs w:val="0"/>
+                <w:lang w:val="en-CA"/>
+              </w:rPr>
+              <w:t>Structured assessments</w:t>
+            </w:r>
+          </w:p>
+          <w:p>
+            <w:pPr>
+              <w:pStyle w:val="list1"/>
+              <w:numPr>
+                <w:ilvl w:val="1"/>
+                <w:numId w:val="8"/>
+              </w:numPr>
+              <w:rPr>
+                <w:b w:val="0"/>
+                <w:bCs w:val="0"/>
+                <w:lang w:val="en-CA"/>
+              </w:rPr>
+            </w:pPr>
+            <w:r>
+              <w:rPr>
+                <w:b w:val="0"/>
+                <w:bCs w:val="0"/>
+                <w:lang w:val="en-CA"/>
+              </w:rPr>
+              <w:t>Safety goals and planning</w:t>
+            </w:r>
+          </w:p>
+          <w:p>
+            <w:pPr>
+              <w:pStyle w:val="list1"/>
+              <w:numPr>
+                <w:ilvl w:val="1"/>
+                <w:numId w:val="8"/>
+              </w:numPr>
+              <w:rPr>
+                <w:b w:val="0"/>
+                <w:bCs w:val="0"/>
+                <w:lang w:val="en-CA"/>
+              </w:rPr>
+            </w:pPr>
+            <w:r>
+              <w:rPr>
+                <w:b w:val="0"/>
+                <w:bCs w:val="0"/>
+                <w:lang w:val="en-CA"/>
+              </w:rPr>
+              <w:t>Ongoing review checkpoints</w:t>
             </w:r>
           </w:p>
           <w:p>
@@ -1788,139 +2281,43 @@
                 <w:bCs w:val="0"/>
                 <w:lang w:val="en-CA"/>
               </w:rPr>
-              <w:t>Structured intake workflows with mandatory fields</w:t>
+              <w:t>Visibility into historical and related cases</w:t>
             </w:r>
           </w:p>
           <w:p>
             <w:pPr>
               <w:pStyle w:val="list1"/>
-              <w:numPr>
-                <w:ilvl w:val="0"/>
-                <w:numId w:val="15"/>
-              </w:numPr>
-              <w:rPr>
-                <w:b w:val="0"/>
-                <w:bCs w:val="0"/>
-                <w:lang w:val="en-CA"/>
-              </w:rPr>
-            </w:pPr>
-            <w:r>
-              <w:rPr>
-                <w:b w:val="0"/>
-                <w:bCs w:val="0"/>
-                <w:lang w:val="en-CA"/>
-              </w:rPr>
-              <w:t>Intake status tracking and lifecycle</w:t>
+              <w:rPr>
+                <w:b w:val="0"/>
+                <w:bCs w:val="0"/>
+                <w:lang w:val="en-CA"/>
+              </w:rPr>
+            </w:pPr>
+            <w:r>
+              <w:rPr>
+                <w:b w:val="0"/>
+                <w:bCs w:val="0"/>
+                <w:lang w:val="en-CA"/>
+              </w:rPr>
+              <w:t>Case notes for visits, services, and interactions</w:t>
             </w:r>
           </w:p>
           <w:p>
             <w:pPr>
               <w:pStyle w:val="list1"/>
-              <w:numPr>
-                <w:ilvl w:val="0"/>
-                <w:numId w:val="15"/>
-              </w:numPr>
-              <w:rPr>
-                <w:b w:val="0"/>
-                <w:bCs w:val="0"/>
-                <w:lang w:val="en-CA"/>
-              </w:rPr>
-            </w:pPr>
-            <w:r>
-              <w:rPr>
-                <w:b w:val="0"/>
-                <w:bCs w:val="0"/>
-                <w:lang w:val="en-CA"/>
-              </w:rPr>
-              <w:t>Supervisor review and approval processes</w:t>
-            </w:r>
-          </w:p>
-          <w:p>
-            <w:pPr>
-              <w:pStyle w:val="list1"/>
-              <w:numPr>
-                <w:ilvl w:val="0"/>
-                <w:numId w:val="15"/>
-              </w:numPr>
-              <w:rPr>
-                <w:b w:val="0"/>
-                <w:bCs w:val="0"/>
-                <w:lang w:val="en-CA"/>
-              </w:rPr>
-            </w:pPr>
-            <w:r>
-              <w:rPr>
-                <w:b w:val="0"/>
-                <w:bCs w:val="0"/>
-                <w:lang w:val="en-CA"/>
-              </w:rPr>
-              <w:t>Ability to resolve intake without opening a case</w:t>
-            </w:r>
-          </w:p>
-          <w:p>
-            <w:pPr>
-              <w:pStyle w:val="list1"/>
-              <w:numPr>
-                <w:ilvl w:val="0"/>
-                <w:numId w:val="15"/>
-              </w:numPr>
-              <w:rPr>
-                <w:b w:val="0"/>
-                <w:bCs w:val="0"/>
-                <w:lang w:val="en-CA"/>
-              </w:rPr>
-            </w:pPr>
-            <w:r>
-              <w:rPr>
-                <w:b w:val="0"/>
-                <w:bCs w:val="0"/>
-                <w:lang w:val="en-CA"/>
-              </w:rPr>
-              <w:t>Escalation from intake to case creation</w:t>
-            </w:r>
-          </w:p>
-          <w:p>
-            <w:pPr>
-              <w:pStyle w:val="list1"/>
-              <w:numPr>
-                <w:ilvl w:val="0"/>
-                <w:numId w:val="15"/>
-              </w:numPr>
-              <w:rPr>
-                <w:b w:val="0"/>
-                <w:bCs w:val="0"/>
-                <w:lang w:val="en-CA"/>
-              </w:rPr>
-            </w:pPr>
-            <w:r>
-              <w:rPr>
-                <w:b w:val="0"/>
-                <w:bCs w:val="0"/>
-                <w:lang w:val="en-CA"/>
-              </w:rPr>
-              <w:t>Printable intake records</w:t>
-            </w:r>
-          </w:p>
-          <w:p>
-            <w:pPr>
-              <w:pStyle w:val="list1"/>
-              <w:numPr>
-                <w:ilvl w:val="0"/>
-                <w:numId w:val="15"/>
-              </w:numPr>
-              <w:rPr>
-                <w:b w:val="0"/>
-                <w:bCs w:val="0"/>
-                <w:lang w:val="en-CA"/>
-              </w:rPr>
-            </w:pPr>
-            <w:r>
-              <w:rPr>
-                <w:b w:val="0"/>
-                <w:bCs w:val="0"/>
-                <w:lang w:val="en-CA"/>
-              </w:rPr>
-              <w:t>Automated notifications:</w:t>
+              <w:rPr>
+                <w:b w:val="0"/>
+                <w:bCs w:val="0"/>
+                <w:lang w:val="en-CA"/>
+              </w:rPr>
+            </w:pPr>
+            <w:r>
+              <w:rPr>
+                <w:b w:val="0"/>
+                <w:bCs w:val="0"/>
+                <w:lang w:val="en-CA"/>
+              </w:rPr>
+              <w:t>Communication tracking across intake and case contexts</w:t>
             </w:r>
           </w:p>
           <w:p>
@@ -1942,29 +2339,7 @@
                 <w:bCs w:val="0"/>
                 <w:lang w:val="en-CA"/>
               </w:rPr>
-              <w:t>In-application alerts</w:t>
-            </w:r>
-          </w:p>
-          <w:p>
-            <w:pPr>
-              <w:pStyle w:val="list1"/>
-              <w:numPr>
-                <w:ilvl w:val="1"/>
-                <w:numId w:val="15"/>
-              </w:numPr>
-              <w:rPr>
-                <w:b w:val="0"/>
-                <w:bCs w:val="0"/>
-                <w:lang w:val="en-CA"/>
-              </w:rPr>
-            </w:pPr>
-            <w:r>
-              <w:rPr>
-                <w:b w:val="0"/>
-                <w:bCs w:val="0"/>
-                <w:lang w:val="en-CA"/>
-              </w:rPr>
-              <w:t>Defined external channels (email/messaging)</w:t>
+              <w:t>Document management: Person, Intake &amp; Case</w:t>
             </w:r>
           </w:p>
         </w:tc>
@@ -1992,7 +2367,7 @@
         </w:rPr>
       </w:pPr>
       <w:r>
-        <w:t>Eligibility Check moved to the Supervisor Review section of the intake workflow.</w:t>
+        <w:t>Placement module improvements:</w:t>
       </w:r>
     </w:p>
     <w:p>
@@ -2001,485 +2376,7 @@
         <w:rPr>
           <w:lang w:val="en-CA"/>
         </w:rPr>
-      </w:pPr>
-      <w:proofErr w:type="gramStart"/>
-      <w:r>
-        <w:t>Intake</w:t>
-      </w:r>
-      <w:proofErr w:type="gramEnd"/>
-      <w:r>
-        <w:t xml:space="preserve"> prior contacts and related fixes:</w:t>
-      </w:r>
-    </w:p>
-    <w:p>
-      <w:pPr>
-        <w:pStyle w:val="list1"/>
-        <w:numPr>
-          <w:ilvl w:val="1"/>
-          <w:numId w:val="8"/>
-        </w:numPr>
-        <w:rPr>
-          <w:lang w:val="en-CA"/>
-        </w:rPr>
-      </w:pPr>
-      <w:r>
-        <w:t xml:space="preserve">Fixed: </w:t>
-      </w:r>
-      <w:proofErr w:type="gramStart"/>
-      <w:r>
-        <w:t>prior</w:t>
-      </w:r>
-      <w:proofErr w:type="gramEnd"/>
-      <w:r>
-        <w:t xml:space="preserve"> contacts missing when viewing intake in edit mode</w:t>
-      </w:r>
-    </w:p>
-    <w:p>
-      <w:pPr>
-        <w:pStyle w:val="list1"/>
-        <w:numPr>
-          <w:ilvl w:val="1"/>
-          <w:numId w:val="8"/>
-        </w:numPr>
-        <w:rPr>
-          <w:lang w:val="en-CA"/>
-        </w:rPr>
-      </w:pPr>
-      <w:r>
-        <w:t>Case file link wired up in the prior contacts section — workers can navigate directly to related case files</w:t>
-      </w:r>
-    </w:p>
-    <w:p>
-      <w:pPr>
-        <w:pStyle w:val="list1"/>
-        <w:numPr>
-          <w:ilvl w:val="1"/>
-          <w:numId w:val="8"/>
-        </w:numPr>
-        <w:rPr>
-          <w:lang w:val="en-CA"/>
-        </w:rPr>
-      </w:pPr>
-      <w:r>
-        <w:t>Fixed: self-intake fields not being saved correctly</w:t>
-      </w:r>
-    </w:p>
-    <w:p>
-      <w:pPr>
-        <w:pStyle w:val="list1"/>
-        <w:numPr>
-          <w:ilvl w:val="1"/>
-          <w:numId w:val="8"/>
-        </w:numPr>
-        <w:rPr>
-          <w:lang w:val="en-CA"/>
-        </w:rPr>
-      </w:pPr>
-      <w:r>
-        <w:t>Document replacement logic improved — updating a document now correctly replaces the prior version.</w:t>
-      </w:r>
-    </w:p>
-    <w:p>
-      <w:pPr>
-        <w:pStyle w:val="list1"/>
-        <w:numPr>
-          <w:ilvl w:val="1"/>
-          <w:numId w:val="8"/>
-        </w:numPr>
-        <w:spacing w:after="360"/>
-        <w:rPr>
-          <w:lang w:val="en-CA"/>
-        </w:rPr>
-      </w:pPr>
-      <w:r>
-        <w:t>Person activity logging updates.</w:t>
-      </w:r>
-    </w:p>
-    <w:p>
-      <w:pPr>
-        <w:spacing w:before="0" w:after="160" w:line="278" w:lineRule="auto"/>
-        <w:rPr>
-          <w:lang w:val="en-CA"/>
-        </w:rPr>
-      </w:pPr>
-      <w:r>
-        <w:rPr>
-          <w:lang w:val="en-CA"/>
-        </w:rPr>
-        <w:br w:type="page"/>
-      </w:r>
-    </w:p>
-    <w:p>
-      <w:pPr>
-        <w:pStyle w:val="list1"/>
-        <w:numPr>
-          <w:ilvl w:val="0"/>
-          <w:numId w:val="0"/>
-        </w:numPr>
-        <w:spacing w:after="360"/>
         <w:ind w:left="720"/>
-        <w:rPr>
-          <w:lang w:val="en-CA"/>
-        </w:rPr>
-      </w:pPr>
-    </w:p>
-    <w:tbl>
-      <w:tblPr>
-        <w:tblStyle w:val="LightList-Accent2"/>
-        <w:tblW w:w="0" w:type="auto"/>
-        <w:tblLook w:val="04A0" w:firstRow="1" w:lastRow="0" w:firstColumn="1" w:lastColumn="0" w:noHBand="0" w:noVBand="1"/>
-      </w:tblPr>
-      <w:tblGrid>
-        <w:gridCol w:w="9340"/>
-      </w:tblGrid>
-      <w:tr>
-        <w:trPr>
-          <w:cnfStyle w:val="100000000000" w:firstRow="1" w:lastRow="0" w:firstColumn="0" w:lastColumn="0" w:oddVBand="0" w:evenVBand="0" w:oddHBand="0" w:evenHBand="0" w:firstRowFirstColumn="0" w:firstRowLastColumn="0" w:lastRowFirstColumn="0" w:lastRowLastColumn="0"/>
-          <w:trHeight w:val="213"/>
-        </w:trPr>
-        <w:tc>
-          <w:tcPr>
-            <w:cnfStyle w:val="001000000000" w:firstRow="0" w:lastRow="0" w:firstColumn="1" w:lastColumn="0" w:oddVBand="0" w:evenVBand="0" w:oddHBand="0" w:evenHBand="0" w:firstRowFirstColumn="0" w:firstRowLastColumn="0" w:lastRowFirstColumn="0" w:lastRowLastColumn="0"/>
-            <w:tcW w:w="9340" w:type="dxa"/>
-            <w:vAlign w:val="center"/>
-          </w:tcPr>
-          <w:p>
-            <w:pPr>
-              <w:pStyle w:val="list1"/>
-              <w:numPr>
-                <w:ilvl w:val="0"/>
-                <w:numId w:val="0"/>
-              </w:numPr>
-              <w:rPr>
-                <w:lang w:val="en-CA"/>
-              </w:rPr>
-            </w:pPr>
-            <w:r>
-              <w:rPr>
-                <w:color w:val="FFFFFF" w:themeColor="background1"/>
-                <w:lang w:val="en-CA"/>
-              </w:rPr>
-              <w:t>I5</w:t>
-            </w:r>
-            <w:r>
-              <w:rPr>
-                <w:color w:val="FFFFFF" w:themeColor="background1"/>
-                <w:lang w:val="en-CA"/>
-              </w:rPr>
-              <w:t xml:space="preserve"> A</w:t>
-            </w:r>
-            <w:r>
-              <w:rPr>
-                <w:color w:val="FFFFFF" w:themeColor="background1"/>
-                <w:lang w:val="en-CA"/>
-              </w:rPr>
-              <w:t xml:space="preserve"> - Case File Management &amp; Signs of Safety</w:t>
-            </w:r>
-          </w:p>
-        </w:tc>
-      </w:tr>
-      <w:tr>
-        <w:trPr>
-          <w:cnfStyle w:val="000000100000" w:firstRow="0" w:lastRow="0" w:firstColumn="0" w:lastColumn="0" w:oddVBand="0" w:evenVBand="0" w:oddHBand="1" w:evenHBand="0" w:firstRowFirstColumn="0" w:firstRowLastColumn="0" w:lastRowFirstColumn="0" w:lastRowLastColumn="0"/>
-          <w:trHeight w:val="1540"/>
-        </w:trPr>
-        <w:tc>
-          <w:tcPr>
-            <w:cnfStyle w:val="001000000000" w:firstRow="0" w:lastRow="0" w:firstColumn="1" w:lastColumn="0" w:oddVBand="0" w:evenVBand="0" w:oddHBand="0" w:evenHBand="0" w:firstRowFirstColumn="0" w:firstRowLastColumn="0" w:lastRowFirstColumn="0" w:lastRowLastColumn="0"/>
-            <w:tcW w:w="9340" w:type="dxa"/>
-          </w:tcPr>
-          <w:p>
-            <w:pPr>
-              <w:pStyle w:val="Section"/>
-              <w:rPr>
-                <w:b/>
-                <w:bCs/>
-                <w:lang w:val="en-CA"/>
-              </w:rPr>
-            </w:pPr>
-            <w:r>
-              <w:rPr>
-                <w:b/>
-                <w:bCs/>
-                <w:lang w:val="en-CA"/>
-              </w:rPr>
-              <w:t>Features</w:t>
-            </w:r>
-          </w:p>
-          <w:p>
-            <w:pPr>
-              <w:pStyle w:val="list1"/>
-              <w:rPr>
-                <w:b w:val="0"/>
-                <w:bCs w:val="0"/>
-                <w:lang w:val="en-CA"/>
-              </w:rPr>
-            </w:pPr>
-            <w:r>
-              <w:rPr>
-                <w:b w:val="0"/>
-                <w:bCs w:val="0"/>
-                <w:lang w:val="en-CA"/>
-              </w:rPr>
-              <w:t>Case file creation and lifecycle management</w:t>
-            </w:r>
-          </w:p>
-          <w:p>
-            <w:pPr>
-              <w:pStyle w:val="list1"/>
-              <w:rPr>
-                <w:b w:val="0"/>
-                <w:bCs w:val="0"/>
-                <w:lang w:val="en-CA"/>
-              </w:rPr>
-            </w:pPr>
-            <w:r>
-              <w:rPr>
-                <w:b w:val="0"/>
-                <w:bCs w:val="0"/>
-                <w:lang w:val="en-CA"/>
-              </w:rPr>
-              <w:t>Assignment of caseworkers and supervisors</w:t>
-            </w:r>
-          </w:p>
-          <w:p>
-            <w:pPr>
-              <w:pStyle w:val="list1"/>
-              <w:rPr>
-                <w:b w:val="0"/>
-                <w:bCs w:val="0"/>
-                <w:lang w:val="en-CA"/>
-              </w:rPr>
-            </w:pPr>
-            <w:r>
-              <w:rPr>
-                <w:b w:val="0"/>
-                <w:bCs w:val="0"/>
-                <w:lang w:val="en-CA"/>
-              </w:rPr>
-              <w:t>Case reassignment with approval</w:t>
-            </w:r>
-          </w:p>
-          <w:p>
-            <w:pPr>
-              <w:pStyle w:val="list1"/>
-              <w:rPr>
-                <w:b w:val="0"/>
-                <w:bCs w:val="0"/>
-                <w:lang w:val="en-CA"/>
-              </w:rPr>
-            </w:pPr>
-            <w:r>
-              <w:rPr>
-                <w:b w:val="0"/>
-                <w:bCs w:val="0"/>
-                <w:lang w:val="en-CA"/>
-              </w:rPr>
-              <w:t>Signs of Safety–aligned workflows, including:</w:t>
-            </w:r>
-          </w:p>
-          <w:p>
-            <w:pPr>
-              <w:pStyle w:val="list1"/>
-              <w:numPr>
-                <w:ilvl w:val="1"/>
-                <w:numId w:val="8"/>
-              </w:numPr>
-              <w:rPr>
-                <w:b w:val="0"/>
-                <w:bCs w:val="0"/>
-                <w:lang w:val="en-CA"/>
-              </w:rPr>
-            </w:pPr>
-            <w:r>
-              <w:rPr>
-                <w:b w:val="0"/>
-                <w:bCs w:val="0"/>
-                <w:lang w:val="en-CA"/>
-              </w:rPr>
-              <w:t>Placement</w:t>
-            </w:r>
-          </w:p>
-          <w:p>
-            <w:pPr>
-              <w:pStyle w:val="list1"/>
-              <w:numPr>
-                <w:ilvl w:val="1"/>
-                <w:numId w:val="8"/>
-              </w:numPr>
-              <w:rPr>
-                <w:b w:val="0"/>
-                <w:bCs w:val="0"/>
-                <w:lang w:val="en-CA"/>
-              </w:rPr>
-            </w:pPr>
-            <w:r>
-              <w:rPr>
-                <w:b w:val="0"/>
-                <w:bCs w:val="0"/>
-                <w:lang w:val="en-CA"/>
-              </w:rPr>
-              <w:t>Structured assessments</w:t>
-            </w:r>
-          </w:p>
-          <w:p>
-            <w:pPr>
-              <w:pStyle w:val="list1"/>
-              <w:numPr>
-                <w:ilvl w:val="1"/>
-                <w:numId w:val="8"/>
-              </w:numPr>
-              <w:rPr>
-                <w:b w:val="0"/>
-                <w:bCs w:val="0"/>
-                <w:lang w:val="en-CA"/>
-              </w:rPr>
-            </w:pPr>
-            <w:r>
-              <w:rPr>
-                <w:b w:val="0"/>
-                <w:bCs w:val="0"/>
-                <w:lang w:val="en-CA"/>
-              </w:rPr>
-              <w:t>Safety goals and planning</w:t>
-            </w:r>
-          </w:p>
-          <w:p>
-            <w:pPr>
-              <w:pStyle w:val="list1"/>
-              <w:numPr>
-                <w:ilvl w:val="1"/>
-                <w:numId w:val="8"/>
-              </w:numPr>
-              <w:rPr>
-                <w:b w:val="0"/>
-                <w:bCs w:val="0"/>
-                <w:lang w:val="en-CA"/>
-              </w:rPr>
-            </w:pPr>
-            <w:r>
-              <w:rPr>
-                <w:b w:val="0"/>
-                <w:bCs w:val="0"/>
-                <w:lang w:val="en-CA"/>
-              </w:rPr>
-              <w:t>Ongoing review checkpoints</w:t>
-            </w:r>
-          </w:p>
-          <w:p>
-            <w:pPr>
-              <w:pStyle w:val="list1"/>
-              <w:numPr>
-                <w:ilvl w:val="0"/>
-                <w:numId w:val="15"/>
-              </w:numPr>
-              <w:rPr>
-                <w:b w:val="0"/>
-                <w:bCs w:val="0"/>
-                <w:lang w:val="en-CA"/>
-              </w:rPr>
-            </w:pPr>
-            <w:r>
-              <w:rPr>
-                <w:b w:val="0"/>
-                <w:bCs w:val="0"/>
-                <w:lang w:val="en-CA"/>
-              </w:rPr>
-              <w:t>Visibility into historical and related cases</w:t>
-            </w:r>
-          </w:p>
-          <w:p>
-            <w:pPr>
-              <w:pStyle w:val="list1"/>
-              <w:rPr>
-                <w:b w:val="0"/>
-                <w:bCs w:val="0"/>
-                <w:lang w:val="en-CA"/>
-              </w:rPr>
-            </w:pPr>
-            <w:r>
-              <w:rPr>
-                <w:b w:val="0"/>
-                <w:bCs w:val="0"/>
-                <w:lang w:val="en-CA"/>
-              </w:rPr>
-              <w:t>Case notes for visits, services, and interactions</w:t>
-            </w:r>
-          </w:p>
-          <w:p>
-            <w:pPr>
-              <w:pStyle w:val="list1"/>
-              <w:rPr>
-                <w:b w:val="0"/>
-                <w:bCs w:val="0"/>
-                <w:lang w:val="en-CA"/>
-              </w:rPr>
-            </w:pPr>
-            <w:r>
-              <w:rPr>
-                <w:b w:val="0"/>
-                <w:bCs w:val="0"/>
-                <w:lang w:val="en-CA"/>
-              </w:rPr>
-              <w:t>Communication tracking across intake and case contexts</w:t>
-            </w:r>
-          </w:p>
-          <w:p>
-            <w:pPr>
-              <w:pStyle w:val="list1"/>
-              <w:numPr>
-                <w:ilvl w:val="1"/>
-                <w:numId w:val="15"/>
-              </w:numPr>
-              <w:rPr>
-                <w:b w:val="0"/>
-                <w:bCs w:val="0"/>
-                <w:lang w:val="en-CA"/>
-              </w:rPr>
-            </w:pPr>
-            <w:r>
-              <w:rPr>
-                <w:b w:val="0"/>
-                <w:bCs w:val="0"/>
-                <w:lang w:val="en-CA"/>
-              </w:rPr>
-              <w:t>Document management: Person, Intake &amp; Case</w:t>
-            </w:r>
-          </w:p>
-        </w:tc>
-      </w:tr>
-    </w:tbl>
-    <w:p>
-      <w:pPr>
-        <w:pStyle w:val="Section"/>
-        <w:rPr>
-          <w:lang w:val="en-CA"/>
-        </w:rPr>
-      </w:pPr>
-      <w:r>
-        <w:rPr>
-          <w:lang w:val="en-CA"/>
-        </w:rPr>
-        <w:t>Weekly Progress</w:t>
-      </w:r>
-    </w:p>
-    <w:p>
-      <w:pPr>
-        <w:pStyle w:val="list1"/>
-        <w:rPr>
-          <w:lang w:val="en-CA"/>
-        </w:rPr>
-      </w:pPr>
-      <w:r>
-        <w:t>Placement module improvements:</w:t>
-      </w:r>
-    </w:p>
-    <w:p>
-      <w:pPr>
-        <w:pStyle w:val="list1"/>
-        <w:rPr>
-          <w:lang w:val="en-CA"/>
-        </w:rPr>
       </w:pPr>
       <w:r>
         <w:t>Fixed: resource home type not displaying caregiver information</w:t>
@@ -2491,6 +2388,7 @@
         <w:rPr>
           <w:lang w:val="en-CA"/>
         </w:rPr>
+        <w:ind w:left="720"/>
       </w:pPr>
       <w:r>
         <w:t>Placement search fix</w:t>
@@ -2502,17 +2400,10 @@
         <w:rPr>
           <w:lang w:val="en-CA"/>
         </w:rPr>
+        <w:ind w:left="720"/>
       </w:pPr>
       <w:r>
-        <w:t xml:space="preserve">Placement </w:t>
-      </w:r>
-      <w:proofErr w:type="gramStart"/>
-      <w:r>
-        <w:t>end</w:t>
-      </w:r>
-      <w:proofErr w:type="gramEnd"/>
-      <w:r>
-        <w:t xml:space="preserve"> date validation added</w:t>
+        <w:t>Placement end date validation added</w:t>
       </w:r>
     </w:p>
     <w:p>
@@ -2751,28 +2642,6 @@
         <w:t>No new developments this week; solution design continues.</w:t>
       </w:r>
     </w:p>
-    <w:p>
-      <w:pPr>
-        <w:spacing w:before="0" w:after="160" w:line="278" w:lineRule="auto"/>
-      </w:pPr>
-      <w:r>
-        <w:br w:type="page"/>
-      </w:r>
-    </w:p>
-    <w:p>
-      <w:pPr>
-        <w:pStyle w:val="list1"/>
-        <w:numPr>
-          <w:ilvl w:val="0"/>
-          <w:numId w:val="0"/>
-        </w:numPr>
-        <w:spacing w:after="360"/>
-        <w:ind w:left="720"/>
-        <w:rPr>
-          <w:lang w:val="en-CA"/>
-        </w:rPr>
-      </w:pPr>
-    </w:p>
     <w:tbl>
       <w:tblPr>
         <w:tblStyle w:val="LightList-Accent2"/>
@@ -2839,6 +2708,7 @@
                 <w:bCs/>
                 <w:lang w:val="en-CA"/>
               </w:rPr>
+              <w:lastRenderedPageBreak/>
               <w:t>Features</w:t>
             </w:r>
           </w:p>
@@ -2942,15 +2812,6 @@
       <w:r>
         <w:t>No data migration activity this week.</w:t>
       </w:r>
-    </w:p>
-    <w:p>
-      <w:pPr>
-        <w:pStyle w:val="list1"/>
-        <w:spacing w:after="360"/>
-        <w:rPr>
-          <w:lang w:val="en-CA"/>
-        </w:rPr>
-      </w:pPr>
     </w:p>
     <w:tbl>
       <w:tblPr>
@@ -3118,20 +2979,6 @@
       <w:r>
         <w:t>Finance module in solution design following June 19 requirements session — Rob reviewing shared documentation (GL codes, funding stream maps, PO forms, policy manual); follow-up design session to be scheduled on completion.</w:t>
       </w:r>
-    </w:p>
-    <w:p>
-      <w:pPr>
-        <w:pStyle w:val="list1"/>
-        <w:numPr>
-          <w:ilvl w:val="0"/>
-          <w:numId w:val="0"/>
-        </w:numPr>
-        <w:spacing w:after="360"/>
-        <w:ind w:left="720"/>
-        <w:rPr>
-          <w:lang w:val="en-CA"/>
-        </w:rPr>
-      </w:pPr>
     </w:p>
     <w:tbl>
       <w:tblPr>
@@ -3440,7 +3287,7 @@
           <wp:extent cx="1428115" cy="357028"/>
           <wp:effectExtent l="0" t="0" r="635" b="5080"/>
           <wp:wrapNone/>
-          <wp:docPr id="2076742082" name="Picture 559663804">
+          <wp:docPr id="17" name="Picture 559663804">
             <a:extLst xmlns:a="http://schemas.openxmlformats.org/drawingml/2006/main">
               <a:ext uri="{FF2B5EF4-FFF2-40B4-BE49-F238E27FC236}">
                 <a16:creationId xmlns:a16="http://schemas.microsoft.com/office/drawing/2014/main" id="{BA02F97D-7065-4B84-AFAF-E7BFCC270E65}"/>

</xml_diff>